<commit_message>
Changing Title and working on Aim and Scope
Adding some modifications to the title and working on topics: Aim and Scope
</commit_message>
<xml_diff>
--- a/CA1 - Capstone Project Proposal - Strategic Thinking.docx
+++ b/CA1 - Capstone Project Proposal - Strategic Thinking.docx
@@ -789,6 +789,7 @@
                 <w:szCs w:val="32"/>
               </w:rPr>
             </w:pPr>
+            <w:proofErr w:type="spellStart"/>
             <w:ins w:id="29" w:author="Victor Furlan" w:date="2026-10-05T18:11:00Z" w16du:dateUtc="2026-10-05T17:11:00Z">
               <w:r>
                 <w:rPr>
@@ -797,7 +798,17 @@
                   <w:sz w:val="32"/>
                   <w:szCs w:val="32"/>
                 </w:rPr>
-                <w:t>Taufique Ahmed</w:t>
+                <w:t>Taufique</w:t>
+              </w:r>
+              <w:proofErr w:type="spellEnd"/>
+              <w:r>
+                <w:rPr>
+                  <w:i/>
+                  <w:color w:val="156082"/>
+                  <w:sz w:val="32"/>
+                  <w:szCs w:val="32"/>
+                </w:rPr>
+                <w:t xml:space="preserve"> Ahmed</w:t>
               </w:r>
             </w:ins>
             <w:ins w:id="30" w:author="naomie mboma" w:date="2026-04-19T22:10:00Z" w16du:dateUtc="2026-04-19T21:10:00Z">
@@ -1389,7 +1400,23 @@
                                 <w:color w:val="000000"/>
                                 <w:sz w:val="28"/>
                               </w:rPr>
-                              <w:t xml:space="preserve">By submitting this assessment, I confirm that I have read the CCT policy on academic misconduct and understand the implications of submitting work that is not my own or does not appropriately reference material taken from a third party or other source. </w:t>
+                              <w:t xml:space="preserve">By submitting this assessment, I confirm that I have read the CCT policy on academic misconduct and understand the implications of submitting work that is not my own or does not appropriately reference material </w:t>
+                            </w:r>
+                            <w:proofErr w:type="gramStart"/>
+                            <w:r>
+                              <w:rPr>
+                                <w:color w:val="000000"/>
+                                <w:sz w:val="28"/>
+                              </w:rPr>
+                              <w:t>taken</w:t>
+                            </w:r>
+                            <w:proofErr w:type="gramEnd"/>
+                            <w:r>
+                              <w:rPr>
+                                <w:color w:val="000000"/>
+                                <w:sz w:val="28"/>
+                              </w:rPr>
+                              <w:t xml:space="preserve"> from a third party or other source. </w:t>
                             </w:r>
                           </w:p>
                           <w:p>
@@ -5821,7 +5848,6 @@
           <w:docPartUnique/>
         </w:docPartObj>
       </w:sdtPr>
-      <w:sdtEndPr/>
       <w:sdtContent>
         <w:customXmlDelRangeEnd w:id="570"/>
         <w:p>
@@ -8135,33 +8161,21 @@
         <w:spacing w:line="278" w:lineRule="auto"/>
         <w:jc w:val="both"/>
         <w:rPr>
-          <w:ins w:id="950" w:author="Victor Furlan" w:date="2026-10-05T17:56:00Z" w16du:dateUtc="2026-10-05T16:56:00Z"/>
+          <w:ins w:id="950" w:author="Victor Furlan" w:date="2026-10-15T18:53:00Z" w16du:dateUtc="2026-10-15T17:53:00Z"/>
           <w:b/>
           <w:bCs/>
           <w:sz w:val="32"/>
           <w:szCs w:val="32"/>
-          <w:rPrChange w:id="951" w:author="Victor Furlan" w:date="2026-10-14T21:14:00Z" w16du:dateUtc="2026-10-14T20:14:00Z">
-            <w:rPr>
-              <w:ins w:id="952" w:author="Victor Furlan" w:date="2026-10-05T17:56:00Z" w16du:dateUtc="2026-10-05T16:56:00Z"/>
-              <w:b/>
-              <w:bCs/>
-            </w:rPr>
-          </w:rPrChange>
-        </w:rPr>
-        <w:pPrChange w:id="953" w:author="Victor Furlan" w:date="2026-10-14T21:26:00Z" w16du:dateUtc="2026-10-14T20:26:00Z">
-          <w:pPr>
-            <w:spacing w:line="278" w:lineRule="auto"/>
-          </w:pPr>
-        </w:pPrChange>
-      </w:pPr>
-      <w:ins w:id="954" w:author="Victor Furlan" w:date="2026-10-14T21:14:00Z" w16du:dateUtc="2026-10-14T20:14:00Z">
+        </w:rPr>
+      </w:pPr>
+      <w:ins w:id="951" w:author="Victor Furlan" w:date="2026-10-14T21:14:00Z" w16du:dateUtc="2026-10-14T20:14:00Z">
         <w:r>
           <w:rPr>
             <w:b/>
             <w:bCs/>
             <w:sz w:val="32"/>
             <w:szCs w:val="32"/>
-            <w:rPrChange w:id="955" w:author="Victor Furlan" w:date="2026-10-14T21:14:00Z" w16du:dateUtc="2026-10-14T20:14:00Z">
+            <w:rPrChange w:id="952" w:author="Victor Furlan" w:date="2026-10-14T21:14:00Z" w16du:dateUtc="2026-10-14T20:14:00Z">
               <w:rPr>
                 <w:b/>
                 <w:bCs/>
@@ -8171,14 +8185,14 @@
           <w:t>P</w:t>
         </w:r>
       </w:ins>
-      <w:ins w:id="956" w:author="Victor Furlan" w:date="2026-10-05T17:56:00Z" w16du:dateUtc="2026-10-05T16:56:00Z">
+      <w:ins w:id="953" w:author="Victor Furlan" w:date="2026-10-05T17:56:00Z" w16du:dateUtc="2026-10-05T16:56:00Z">
         <w:r>
           <w:rPr>
             <w:b/>
             <w:bCs/>
             <w:sz w:val="32"/>
             <w:szCs w:val="32"/>
-            <w:rPrChange w:id="957" w:author="Victor Furlan" w:date="2026-10-14T21:14:00Z" w16du:dateUtc="2026-10-14T20:14:00Z">
+            <w:rPrChange w:id="954" w:author="Victor Furlan" w:date="2026-10-14T21:14:00Z" w16du:dateUtc="2026-10-14T20:14:00Z">
               <w:rPr>
                 <w:b/>
                 <w:bCs/>
@@ -8194,17 +8208,42 @@
         <w:spacing w:line="278" w:lineRule="auto"/>
         <w:jc w:val="both"/>
         <w:rPr>
-          <w:ins w:id="958" w:author="Victor Furlan" w:date="2026-10-05T17:56:00Z" w16du:dateUtc="2026-10-05T16:56:00Z"/>
+          <w:ins w:id="955" w:author="Victor Furlan" w:date="2026-10-05T17:56:00Z" w16du:dateUtc="2026-10-05T16:56:00Z"/>
           <w:b/>
           <w:bCs/>
-        </w:rPr>
-        <w:pPrChange w:id="959" w:author="Victor Furlan" w:date="2026-10-14T21:26:00Z" w16du:dateUtc="2026-10-14T20:26:00Z">
+          <w:sz w:val="32"/>
+          <w:szCs w:val="32"/>
+          <w:rPrChange w:id="956" w:author="Victor Furlan" w:date="2026-10-14T21:14:00Z" w16du:dateUtc="2026-10-14T20:14:00Z">
+            <w:rPr>
+              <w:ins w:id="957" w:author="Victor Furlan" w:date="2026-10-05T17:56:00Z" w16du:dateUtc="2026-10-05T16:56:00Z"/>
+              <w:b/>
+              <w:bCs/>
+            </w:rPr>
+          </w:rPrChange>
+        </w:rPr>
+        <w:pPrChange w:id="958" w:author="Victor Furlan" w:date="2026-10-14T21:26:00Z" w16du:dateUtc="2026-10-14T20:26:00Z">
           <w:pPr>
             <w:spacing w:line="278" w:lineRule="auto"/>
           </w:pPr>
         </w:pPrChange>
       </w:pPr>
-      <w:ins w:id="960" w:author="Victor Furlan" w:date="2026-10-05T17:56:00Z" w16du:dateUtc="2026-10-05T16:56:00Z">
+    </w:p>
+    <w:p>
+      <w:pPr>
+        <w:spacing w:line="278" w:lineRule="auto"/>
+        <w:jc w:val="both"/>
+        <w:rPr>
+          <w:ins w:id="959" w:author="Victor Furlan" w:date="2026-10-05T17:56:00Z" w16du:dateUtc="2026-10-05T16:56:00Z"/>
+          <w:b/>
+          <w:bCs/>
+        </w:rPr>
+        <w:pPrChange w:id="960" w:author="Victor Furlan" w:date="2026-10-14T21:26:00Z" w16du:dateUtc="2026-10-14T20:26:00Z">
+          <w:pPr>
+            <w:spacing w:line="278" w:lineRule="auto"/>
+          </w:pPr>
+        </w:pPrChange>
+      </w:pPr>
+      <w:ins w:id="961" w:author="Victor Furlan" w:date="2026-10-05T17:56:00Z" w16du:dateUtc="2026-10-05T16:56:00Z">
         <w:r>
           <w:rPr>
             <w:b/>
@@ -8219,15 +8258,15 @@
         <w:spacing w:line="278" w:lineRule="auto"/>
         <w:jc w:val="both"/>
         <w:rPr>
-          <w:ins w:id="961" w:author="Victor Furlan" w:date="2026-10-05T17:56:00Z" w16du:dateUtc="2026-10-05T16:56:00Z"/>
-        </w:rPr>
-        <w:pPrChange w:id="962" w:author="Victor Furlan" w:date="2026-10-14T21:26:00Z" w16du:dateUtc="2026-10-14T20:26:00Z">
+          <w:ins w:id="962" w:author="Victor Furlan" w:date="2026-10-05T17:56:00Z" w16du:dateUtc="2026-10-05T16:56:00Z"/>
+        </w:rPr>
+        <w:pPrChange w:id="963" w:author="Victor Furlan" w:date="2026-10-14T21:26:00Z" w16du:dateUtc="2026-10-14T20:26:00Z">
           <w:pPr>
             <w:spacing w:line="278" w:lineRule="auto"/>
           </w:pPr>
         </w:pPrChange>
       </w:pPr>
-      <w:ins w:id="963" w:author="Victor Furlan" w:date="2026-10-05T17:56:00Z" w16du:dateUtc="2026-10-05T16:56:00Z">
+      <w:ins w:id="964" w:author="Victor Furlan" w:date="2026-10-05T17:56:00Z" w16du:dateUtc="2026-10-05T16:56:00Z">
         <w:r>
           <w:t>The cinema industry operates in an increasingly competitive entertainment environment where consumers can choose between traditional cinema experiences and a wide range of home-based streaming services. Factors such as ticket price, convenience, movie availability, social experiences, screen and sound quality, and consumer preferences may influence whether an individual chooses to visit a cinema. Understanding these factors can help cinema businesses make more informed decisions regarding pricing, customer experience, marketing and retention strategies.</w:t>
         </w:r>
@@ -8238,15 +8277,15 @@
         <w:spacing w:line="278" w:lineRule="auto"/>
         <w:jc w:val="both"/>
         <w:rPr>
-          <w:ins w:id="964" w:author="Victor Furlan" w:date="2026-10-05T17:56:00Z" w16du:dateUtc="2026-10-05T16:56:00Z"/>
-        </w:rPr>
-        <w:pPrChange w:id="965" w:author="Victor Furlan" w:date="2026-10-14T21:26:00Z" w16du:dateUtc="2026-10-14T20:26:00Z">
+          <w:ins w:id="965" w:author="Victor Furlan" w:date="2026-10-05T17:56:00Z" w16du:dateUtc="2026-10-05T16:56:00Z"/>
+        </w:rPr>
+        <w:pPrChange w:id="966" w:author="Victor Furlan" w:date="2026-10-14T21:26:00Z" w16du:dateUtc="2026-10-14T20:26:00Z">
           <w:pPr>
             <w:spacing w:line="278" w:lineRule="auto"/>
           </w:pPr>
         </w:pPrChange>
       </w:pPr>
-      <w:ins w:id="966" w:author="Victor Furlan" w:date="2026-10-05T17:56:00Z" w16du:dateUtc="2026-10-05T16:56:00Z">
+      <w:ins w:id="967" w:author="Victor Furlan" w:date="2026-10-05T17:56:00Z" w16du:dateUtc="2026-10-05T16:56:00Z">
         <w:r>
           <w:t>This project proposes the use of data analytics and predictive modelling to investigate the factors that influence cinema attendance and to develop a predictive model capable of identifying consumers who are more likely to be frequent cinema visitors. The project will use primary data collected through an 11-question online survey focusing on cinema attendance, movie preferences, spending behaviour, reasons for visiting cinemas, streaming preferences and the importance of different cinema experience factors.</w:t>
         </w:r>
@@ -8257,15 +8296,15 @@
         <w:spacing w:line="278" w:lineRule="auto"/>
         <w:jc w:val="both"/>
         <w:rPr>
-          <w:ins w:id="967" w:author="Victor Furlan" w:date="2026-10-05T17:56:00Z" w16du:dateUtc="2026-10-05T16:56:00Z"/>
-        </w:rPr>
-        <w:pPrChange w:id="968" w:author="Victor Furlan" w:date="2026-10-14T21:26:00Z" w16du:dateUtc="2026-10-14T20:26:00Z">
+          <w:ins w:id="968" w:author="Victor Furlan" w:date="2026-10-05T17:56:00Z" w16du:dateUtc="2026-10-05T16:56:00Z"/>
+        </w:rPr>
+        <w:pPrChange w:id="969" w:author="Victor Furlan" w:date="2026-10-14T21:26:00Z" w16du:dateUtc="2026-10-14T20:26:00Z">
           <w:pPr>
             <w:spacing w:line="278" w:lineRule="auto"/>
           </w:pPr>
         </w:pPrChange>
       </w:pPr>
-      <w:ins w:id="969" w:author="Victor Furlan" w:date="2026-10-05T17:56:00Z" w16du:dateUtc="2026-10-05T16:56:00Z">
+      <w:ins w:id="970" w:author="Victor Furlan" w:date="2026-10-05T17:56:00Z" w16du:dateUtc="2026-10-05T16:56:00Z">
         <w:r>
           <w:t>The project is appropriate for business analytics because it combines descriptive and exploratory analysis with predictive modelling and translates the results into potential business recommendations. Rather than simply determining how often people go to the cinema, the project will investigate why attendance varies between consumers and whether their behaviour can be used to predict attendance patterns.</w:t>
         </w:r>
@@ -8276,13 +8315,8 @@
         <w:spacing w:line="278" w:lineRule="auto"/>
         <w:jc w:val="both"/>
         <w:rPr>
-          <w:ins w:id="970" w:author="Victor Furlan" w:date="2026-10-05T17:56:00Z" w16du:dateUtc="2026-10-05T16:56:00Z"/>
-        </w:rPr>
-        <w:pPrChange w:id="971" w:author="Victor Furlan" w:date="2026-10-14T21:26:00Z" w16du:dateUtc="2026-10-14T20:26:00Z">
-          <w:pPr>
-            <w:spacing w:line="278" w:lineRule="auto"/>
-          </w:pPr>
-        </w:pPrChange>
+          <w:ins w:id="971" w:author="Victor Furlan" w:date="2026-10-15T18:53:00Z" w16du:dateUtc="2026-10-15T17:53:00Z"/>
+        </w:rPr>
       </w:pPr>
       <w:ins w:id="972" w:author="Victor Furlan" w:date="2026-10-05T17:56:00Z" w16du:dateUtc="2026-10-05T16:56:00Z">
         <w:r>
@@ -8296,8 +8330,6 @@
         <w:jc w:val="both"/>
         <w:rPr>
           <w:ins w:id="973" w:author="Victor Furlan" w:date="2026-10-05T17:56:00Z" w16du:dateUtc="2026-10-05T16:56:00Z"/>
-          <w:b/>
-          <w:bCs/>
         </w:rPr>
         <w:pPrChange w:id="974" w:author="Victor Furlan" w:date="2026-10-14T21:26:00Z" w16du:dateUtc="2026-10-14T20:26:00Z">
           <w:pPr>
@@ -8305,7 +8337,23 @@
           </w:pPr>
         </w:pPrChange>
       </w:pPr>
-      <w:ins w:id="975" w:author="Victor Furlan" w:date="2026-10-05T17:56:00Z" w16du:dateUtc="2026-10-05T16:56:00Z">
+    </w:p>
+    <w:p>
+      <w:pPr>
+        <w:spacing w:line="278" w:lineRule="auto"/>
+        <w:jc w:val="both"/>
+        <w:rPr>
+          <w:ins w:id="975" w:author="Victor Furlan" w:date="2026-10-05T17:56:00Z" w16du:dateUtc="2026-10-05T16:56:00Z"/>
+          <w:b/>
+          <w:bCs/>
+        </w:rPr>
+        <w:pPrChange w:id="976" w:author="Victor Furlan" w:date="2026-10-14T21:26:00Z" w16du:dateUtc="2026-10-14T20:26:00Z">
+          <w:pPr>
+            <w:spacing w:line="278" w:lineRule="auto"/>
+          </w:pPr>
+        </w:pPrChange>
+      </w:pPr>
+      <w:ins w:id="977" w:author="Victor Furlan" w:date="2026-10-05T17:56:00Z" w16du:dateUtc="2026-10-05T16:56:00Z">
         <w:r>
           <w:rPr>
             <w:b/>
@@ -8320,17 +8368,25 @@
         <w:spacing w:line="278" w:lineRule="auto"/>
         <w:jc w:val="both"/>
         <w:rPr>
-          <w:ins w:id="976" w:author="Victor Furlan" w:date="2026-10-05T17:56:00Z" w16du:dateUtc="2026-10-05T16:56:00Z"/>
-        </w:rPr>
-        <w:pPrChange w:id="977" w:author="Victor Furlan" w:date="2026-10-14T21:26:00Z" w16du:dateUtc="2026-10-14T20:26:00Z">
+          <w:ins w:id="978" w:author="Victor Furlan" w:date="2026-10-05T17:56:00Z" w16du:dateUtc="2026-10-05T16:56:00Z"/>
+        </w:rPr>
+        <w:pPrChange w:id="979" w:author="Victor Furlan" w:date="2026-10-14T21:26:00Z" w16du:dateUtc="2026-10-14T20:26:00Z">
           <w:pPr>
             <w:spacing w:line="278" w:lineRule="auto"/>
           </w:pPr>
         </w:pPrChange>
       </w:pPr>
-      <w:ins w:id="978" w:author="Victor Furlan" w:date="2026-10-05T17:56:00Z" w16du:dateUtc="2026-10-05T16:56:00Z">
-        <w:r>
-          <w:t>Cinema businesses need to understand changing consumer behaviour in order to attract and retain customers. A consumer may choose to visit the cinema because of the quality of the experience, a particular movie release or the social aspect of going with friends or family. Conversely, high prices, convenience of streaming services, location or other factors may discourage cinema attendance.</w:t>
+      <w:ins w:id="980" w:author="Victor Furlan" w:date="2026-10-05T17:56:00Z" w16du:dateUtc="2026-10-05T16:56:00Z">
+        <w:r>
+          <w:t xml:space="preserve">Cinema businesses need to understand changing consumer behaviour </w:t>
+        </w:r>
+        <w:proofErr w:type="gramStart"/>
+        <w:r>
+          <w:t>in order to</w:t>
+        </w:r>
+        <w:proofErr w:type="gramEnd"/>
+        <w:r>
+          <w:t xml:space="preserve"> attract and retain customers. A consumer may choose to visit the cinema because of the quality of the experience, a particular movie release or the social aspect of going with friends or family. Conversely, high prices, convenience of streaming services, location or other factors may discourage cinema attendance.</w:t>
         </w:r>
       </w:ins>
     </w:p>
@@ -8339,15 +8395,15 @@
         <w:spacing w:line="278" w:lineRule="auto"/>
         <w:jc w:val="both"/>
         <w:rPr>
-          <w:ins w:id="979" w:author="Victor Furlan" w:date="2026-10-05T17:56:00Z" w16du:dateUtc="2026-10-05T16:56:00Z"/>
-        </w:rPr>
-        <w:pPrChange w:id="980" w:author="Victor Furlan" w:date="2026-10-14T21:26:00Z" w16du:dateUtc="2026-10-14T20:26:00Z">
+          <w:ins w:id="981" w:author="Victor Furlan" w:date="2026-10-05T17:56:00Z" w16du:dateUtc="2026-10-05T16:56:00Z"/>
+        </w:rPr>
+        <w:pPrChange w:id="982" w:author="Victor Furlan" w:date="2026-10-14T21:26:00Z" w16du:dateUtc="2026-10-14T20:26:00Z">
           <w:pPr>
             <w:spacing w:line="278" w:lineRule="auto"/>
           </w:pPr>
         </w:pPrChange>
       </w:pPr>
-      <w:ins w:id="981" w:author="Victor Furlan" w:date="2026-10-05T17:56:00Z" w16du:dateUtc="2026-10-05T16:56:00Z">
+      <w:ins w:id="983" w:author="Victor Furlan" w:date="2026-10-05T17:56:00Z" w16du:dateUtc="2026-10-05T16:56:00Z">
         <w:r>
           <w:t>The business problem addressed by this project is therefore:</w:t>
         </w:r>
@@ -8358,15 +8414,15 @@
         <w:spacing w:line="278" w:lineRule="auto"/>
         <w:jc w:val="both"/>
         <w:rPr>
-          <w:ins w:id="982" w:author="Victor Furlan" w:date="2026-10-05T17:56:00Z" w16du:dateUtc="2026-10-05T16:56:00Z"/>
-        </w:rPr>
-        <w:pPrChange w:id="983" w:author="Victor Furlan" w:date="2026-10-14T21:26:00Z" w16du:dateUtc="2026-10-14T20:26:00Z">
+          <w:ins w:id="984" w:author="Victor Furlan" w:date="2026-10-05T17:56:00Z" w16du:dateUtc="2026-10-05T16:56:00Z"/>
+        </w:rPr>
+        <w:pPrChange w:id="985" w:author="Victor Furlan" w:date="2026-10-14T21:26:00Z" w16du:dateUtc="2026-10-14T20:26:00Z">
           <w:pPr>
             <w:spacing w:line="278" w:lineRule="auto"/>
           </w:pPr>
         </w:pPrChange>
       </w:pPr>
-      <w:ins w:id="984" w:author="Victor Furlan" w:date="2026-10-05T17:56:00Z" w16du:dateUtc="2026-10-05T16:56:00Z">
+      <w:ins w:id="986" w:author="Victor Furlan" w:date="2026-10-05T17:56:00Z" w16du:dateUtc="2026-10-05T16:56:00Z">
         <w:r>
           <w:rPr>
             <w:b/>
@@ -8381,17 +8437,21 @@
         <w:spacing w:line="278" w:lineRule="auto"/>
         <w:jc w:val="both"/>
         <w:rPr>
-          <w:ins w:id="985" w:author="Victor Furlan" w:date="2026-10-05T17:56:00Z" w16du:dateUtc="2026-10-05T16:56:00Z"/>
-        </w:rPr>
-        <w:pPrChange w:id="986" w:author="Victor Furlan" w:date="2026-10-14T21:26:00Z" w16du:dateUtc="2026-10-14T20:26:00Z">
+          <w:ins w:id="987" w:author="Victor Furlan" w:date="2026-10-05T17:56:00Z" w16du:dateUtc="2026-10-05T16:56:00Z"/>
+        </w:rPr>
+        <w:pPrChange w:id="988" w:author="Victor Furlan" w:date="2026-10-14T21:26:00Z" w16du:dateUtc="2026-10-14T20:26:00Z">
           <w:pPr>
             <w:spacing w:line="278" w:lineRule="auto"/>
           </w:pPr>
         </w:pPrChange>
       </w:pPr>
-      <w:ins w:id="987" w:author="Victor Furlan" w:date="2026-10-05T17:56:00Z" w16du:dateUtc="2026-10-05T16:56:00Z">
-        <w:r>
-          <w:t>The project will analyse relationships between cinema attendance and variables including frequency of cinema visits, willingness to spend, streaming preferences, movie genres, reasons for visiting the cinema, and the perceived importance of ticket price, movie reviews, location, screen and sound quality, seating, food and drinks, and socialising.</w:t>
+      <w:ins w:id="989" w:author="Victor Furlan" w:date="2026-10-05T17:56:00Z" w16du:dateUtc="2026-10-05T16:56:00Z">
+        <w:r>
+          <w:t xml:space="preserve">The project will analyse relationships between cinema attendance and variables including frequency of cinema visits, willingness to spend, streaming preferences, movie genres, reasons for visiting the </w:t>
+        </w:r>
+        <w:r>
+          <w:lastRenderedPageBreak/>
+          <w:t>cinema, and the perceived importance of ticket price, movie reviews, location, screen and sound quality, seating, food and drinks, and socialising.</w:t>
         </w:r>
       </w:ins>
     </w:p>
@@ -8400,21 +8460,346 @@
         <w:spacing w:line="278" w:lineRule="auto"/>
         <w:jc w:val="both"/>
         <w:rPr>
-          <w:ins w:id="988" w:author="Victor Furlan" w:date="2026-10-05T17:56:00Z" w16du:dateUtc="2026-10-05T16:56:00Z"/>
-        </w:rPr>
-        <w:pPrChange w:id="989" w:author="Victor Furlan" w:date="2026-10-14T21:26:00Z" w16du:dateUtc="2026-10-14T20:26:00Z">
+          <w:ins w:id="990" w:author="Victor Furlan" w:date="2026-10-05T17:56:00Z" w16du:dateUtc="2026-10-05T16:56:00Z"/>
+        </w:rPr>
+        <w:pPrChange w:id="991" w:author="Victor Furlan" w:date="2026-10-14T21:26:00Z" w16du:dateUtc="2026-10-14T20:26:00Z">
           <w:pPr>
             <w:spacing w:line="278" w:lineRule="auto"/>
           </w:pPr>
         </w:pPrChange>
       </w:pPr>
-      <w:ins w:id="990" w:author="Victor Furlan" w:date="2026-10-05T17:56:00Z" w16du:dateUtc="2026-10-05T16:56:00Z">
-        <w:r>
-          <w:t xml:space="preserve">The predictive component will classify respondents according to their cinema attendance behaviour. Subject to the final dataset and sample size, cinema attendance frequency may be converted into an </w:t>
-        </w:r>
+      <w:ins w:id="992" w:author="Victor Furlan" w:date="2026-10-05T17:56:00Z" w16du:dateUtc="2026-10-05T16:56:00Z">
+        <w:r>
+          <w:t>The predictive component will classify respondents according to their cinema attendance behaviour. Subject to the final dataset and sample size, cinema attendance frequency may be converted into an appropriate target classification, such as frequent versus infrequent attendance. This will allow different machine-learning techniques to be compared and evaluated.</w:t>
+        </w:r>
+      </w:ins>
+    </w:p>
+    <w:p>
+      <w:pPr>
+        <w:spacing w:line="278" w:lineRule="auto"/>
+        <w:jc w:val="both"/>
+        <w:rPr>
+          <w:ins w:id="993" w:author="Victor Furlan" w:date="2026-10-15T18:53:00Z" w16du:dateUtc="2026-10-15T17:53:00Z"/>
+        </w:rPr>
+      </w:pPr>
+      <w:ins w:id="994" w:author="Victor Furlan" w:date="2026-10-05T17:56:00Z" w16du:dateUtc="2026-10-05T16:56:00Z">
+        <w:r>
+          <w:t>The project therefore moves beyond descriptive statistics by attempting to provide a predictive business tool that could help cinema operators understand customer behaviour and identify factors that may support increased atten</w:t>
+        </w:r>
+      </w:ins>
+      <w:ins w:id="995" w:author="Victor Furlan" w:date="2026-10-14T21:40:00Z" w16du:dateUtc="2026-10-14T20:40:00Z">
+        <w:r>
+          <w:t>dance.</w:t>
+        </w:r>
+      </w:ins>
+    </w:p>
+    <w:p>
+      <w:pPr>
+        <w:spacing w:line="278" w:lineRule="auto"/>
+        <w:jc w:val="both"/>
+        <w:rPr>
+          <w:ins w:id="996" w:author="Victor Furlan" w:date="2026-10-15T18:53:00Z" w16du:dateUtc="2026-10-15T17:53:00Z"/>
+        </w:rPr>
+      </w:pPr>
+    </w:p>
+    <w:p>
+      <w:pPr>
+        <w:spacing w:line="278" w:lineRule="auto"/>
+        <w:jc w:val="both"/>
+        <w:rPr>
+          <w:ins w:id="997" w:author="Victor Furlan" w:date="2026-10-15T18:53:00Z" w16du:dateUtc="2026-10-15T17:53:00Z"/>
+          <w:b/>
+          <w:bCs/>
+          <w:rPrChange w:id="998" w:author="Victor Furlan" w:date="2026-10-15T18:54:00Z" w16du:dateUtc="2026-10-15T17:54:00Z">
+            <w:rPr>
+              <w:ins w:id="999" w:author="Victor Furlan" w:date="2026-10-15T18:53:00Z" w16du:dateUtc="2026-10-15T17:53:00Z"/>
+            </w:rPr>
+          </w:rPrChange>
+        </w:rPr>
+      </w:pPr>
+      <w:ins w:id="1000" w:author="Victor Furlan" w:date="2026-10-15T18:53:00Z" w16du:dateUtc="2026-10-15T17:53:00Z">
+        <w:r>
+          <w:rPr>
+            <w:b/>
+            <w:bCs/>
+            <w:rPrChange w:id="1001" w:author="Victor Furlan" w:date="2026-10-15T18:54:00Z" w16du:dateUtc="2026-10-15T17:54:00Z">
+              <w:rPr/>
+            </w:rPrChange>
+          </w:rPr>
+          <w:t>3. Aim and Objectives</w:t>
+        </w:r>
+      </w:ins>
+    </w:p>
+    <w:p>
+      <w:pPr>
+        <w:spacing w:line="278" w:lineRule="auto"/>
+        <w:jc w:val="both"/>
+        <w:rPr>
+          <w:ins w:id="1002" w:author="Victor Furlan" w:date="2026-10-15T18:53:00Z" w16du:dateUtc="2026-10-15T17:53:00Z"/>
+        </w:rPr>
+      </w:pPr>
+      <w:ins w:id="1003" w:author="Victor Furlan" w:date="2026-10-15T18:53:00Z" w16du:dateUtc="2026-10-15T17:53:00Z">
+        <w:r>
+          <w:t>The aim of this project is to analyse consumer cinema behaviour and investigate whether predictive models can use survey responses to distinguish between frequent and infrequent cinema visitors.</w:t>
+        </w:r>
+      </w:ins>
+    </w:p>
+    <w:p>
+      <w:pPr>
+        <w:spacing w:line="278" w:lineRule="auto"/>
+        <w:jc w:val="both"/>
+        <w:rPr>
+          <w:ins w:id="1004" w:author="Victor Furlan" w:date="2026-10-15T18:53:00Z" w16du:dateUtc="2026-10-15T17:53:00Z"/>
+        </w:rPr>
+      </w:pPr>
+      <w:ins w:id="1005" w:author="Victor Furlan" w:date="2026-10-15T18:53:00Z" w16du:dateUtc="2026-10-15T17:53:00Z">
+        <w:r>
+          <w:t>Objectives</w:t>
+        </w:r>
+      </w:ins>
+      <w:ins w:id="1006" w:author="Victor Furlan" w:date="2026-10-15T18:54:00Z" w16du:dateUtc="2026-10-15T17:54:00Z">
+        <w:r>
+          <w:t>:</w:t>
+        </w:r>
+      </w:ins>
+    </w:p>
+    <w:p>
+      <w:pPr>
+        <w:pStyle w:val="ListParagraph"/>
+        <w:numPr>
+          <w:ilvl w:val="0"/>
+          <w:numId w:val="11"/>
+        </w:numPr>
+        <w:spacing w:line="278" w:lineRule="auto"/>
+        <w:jc w:val="both"/>
+        <w:rPr>
+          <w:ins w:id="1007" w:author="Victor Furlan" w:date="2026-10-15T18:53:00Z" w16du:dateUtc="2026-10-15T17:53:00Z"/>
+        </w:rPr>
+        <w:pPrChange w:id="1008" w:author="Victor Furlan" w:date="2026-10-15T18:54:00Z" w16du:dateUtc="2026-10-15T17:54:00Z">
+          <w:pPr>
+            <w:spacing w:line="278" w:lineRule="auto"/>
+            <w:jc w:val="both"/>
+          </w:pPr>
+        </w:pPrChange>
+      </w:pPr>
+      <w:ins w:id="1009" w:author="Victor Furlan" w:date="2026-10-15T18:53:00Z" w16du:dateUtc="2026-10-15T17:53:00Z">
+        <w:r>
+          <w:t>Collect and prepare survey data about cinema attendance, spending habits, film preferences and streaming behaviour.</w:t>
+        </w:r>
+      </w:ins>
+    </w:p>
+    <w:p>
+      <w:pPr>
+        <w:pStyle w:val="ListParagraph"/>
+        <w:numPr>
+          <w:ilvl w:val="0"/>
+          <w:numId w:val="11"/>
+        </w:numPr>
+        <w:spacing w:line="278" w:lineRule="auto"/>
+        <w:jc w:val="both"/>
+        <w:rPr>
+          <w:ins w:id="1010" w:author="Victor Furlan" w:date="2026-10-15T18:53:00Z" w16du:dateUtc="2026-10-15T17:53:00Z"/>
+        </w:rPr>
+        <w:pPrChange w:id="1011" w:author="Victor Furlan" w:date="2026-10-15T18:54:00Z" w16du:dateUtc="2026-10-15T17:54:00Z">
+          <w:pPr>
+            <w:spacing w:line="278" w:lineRule="auto"/>
+            <w:jc w:val="both"/>
+          </w:pPr>
+        </w:pPrChange>
+      </w:pPr>
+      <w:ins w:id="1012" w:author="Victor Furlan" w:date="2026-10-15T18:53:00Z" w16du:dateUtc="2026-10-15T17:53:00Z">
+        <w:r>
+          <w:t>Use Python and Jupyter Notebook to clean, organise and explore the responses.</w:t>
+        </w:r>
+      </w:ins>
+    </w:p>
+    <w:p>
+      <w:pPr>
+        <w:pStyle w:val="ListParagraph"/>
+        <w:numPr>
+          <w:ilvl w:val="0"/>
+          <w:numId w:val="11"/>
+        </w:numPr>
+        <w:spacing w:line="278" w:lineRule="auto"/>
+        <w:jc w:val="both"/>
+        <w:rPr>
+          <w:ins w:id="1013" w:author="Victor Furlan" w:date="2026-10-15T18:53:00Z" w16du:dateUtc="2026-10-15T17:53:00Z"/>
+        </w:rPr>
+        <w:pPrChange w:id="1014" w:author="Victor Furlan" w:date="2026-10-15T18:54:00Z" w16du:dateUtc="2026-10-15T17:54:00Z">
+          <w:pPr>
+            <w:spacing w:line="278" w:lineRule="auto"/>
+            <w:jc w:val="both"/>
+          </w:pPr>
+        </w:pPrChange>
+      </w:pPr>
+      <w:ins w:id="1015" w:author="Victor Furlan" w:date="2026-10-15T18:53:00Z" w16du:dateUtc="2026-10-15T17:53:00Z">
+        <w:r>
+          <w:t>Examine relationships between attendance frequency and factors such as spending, streaming preferences and the cinema experience.</w:t>
+        </w:r>
+      </w:ins>
+    </w:p>
+    <w:p>
+      <w:pPr>
+        <w:pStyle w:val="ListParagraph"/>
+        <w:numPr>
+          <w:ilvl w:val="0"/>
+          <w:numId w:val="11"/>
+        </w:numPr>
+        <w:spacing w:line="278" w:lineRule="auto"/>
+        <w:jc w:val="both"/>
+        <w:rPr>
+          <w:ins w:id="1016" w:author="Victor Furlan" w:date="2026-10-15T18:53:00Z" w16du:dateUtc="2026-10-15T17:53:00Z"/>
+        </w:rPr>
+        <w:pPrChange w:id="1017" w:author="Victor Furlan" w:date="2026-10-15T18:54:00Z" w16du:dateUtc="2026-10-15T17:54:00Z">
+          <w:pPr>
+            <w:spacing w:line="278" w:lineRule="auto"/>
+            <w:jc w:val="both"/>
+          </w:pPr>
+        </w:pPrChange>
+      </w:pPr>
+      <w:ins w:id="1018" w:author="Victor Furlan" w:date="2026-10-15T18:53:00Z" w16du:dateUtc="2026-10-15T17:53:00Z">
+        <w:r>
+          <w:t>Develop and compare suitable classification models, if the size and quality of the dataset allow it.</w:t>
+        </w:r>
+      </w:ins>
+    </w:p>
+    <w:p>
+      <w:pPr>
+        <w:pStyle w:val="ListParagraph"/>
+        <w:numPr>
+          <w:ilvl w:val="0"/>
+          <w:numId w:val="11"/>
+        </w:numPr>
+        <w:spacing w:line="278" w:lineRule="auto"/>
+        <w:jc w:val="both"/>
+        <w:rPr>
+          <w:ins w:id="1019" w:author="Victor Furlan" w:date="2026-10-15T18:53:00Z" w16du:dateUtc="2026-10-15T17:53:00Z"/>
+        </w:rPr>
+        <w:pPrChange w:id="1020" w:author="Victor Furlan" w:date="2026-10-15T18:54:00Z" w16du:dateUtc="2026-10-15T17:54:00Z">
+          <w:pPr>
+            <w:spacing w:line="278" w:lineRule="auto"/>
+            <w:jc w:val="both"/>
+          </w:pPr>
+        </w:pPrChange>
+      </w:pPr>
+      <w:ins w:id="1021" w:author="Victor Furlan" w:date="2026-10-15T18:53:00Z" w16du:dateUtc="2026-10-15T17:53:00Z">
+        <w:r>
+          <w:t>Use the findings to suggest practical ways cinema businesses could improve customer engagement and encourage visits.</w:t>
+        </w:r>
+      </w:ins>
+    </w:p>
+    <w:p>
+      <w:pPr>
+        <w:spacing w:line="278" w:lineRule="auto"/>
+        <w:jc w:val="both"/>
+        <w:rPr>
+          <w:ins w:id="1022" w:author="Victor Furlan" w:date="2026-10-15T18:53:00Z" w16du:dateUtc="2026-10-15T17:53:00Z"/>
+        </w:rPr>
+      </w:pPr>
+    </w:p>
+    <w:p>
+      <w:pPr>
+        <w:spacing w:line="278" w:lineRule="auto"/>
+        <w:jc w:val="both"/>
+        <w:rPr>
+          <w:ins w:id="1023" w:author="Victor Furlan" w:date="2026-10-15T18:53:00Z" w16du:dateUtc="2026-10-15T17:53:00Z"/>
+          <w:u w:val="single"/>
+          <w:rPrChange w:id="1024" w:author="Victor Furlan" w:date="2026-10-15T18:55:00Z" w16du:dateUtc="2026-10-15T17:55:00Z">
+            <w:rPr>
+              <w:ins w:id="1025" w:author="Victor Furlan" w:date="2026-10-15T18:53:00Z" w16du:dateUtc="2026-10-15T17:53:00Z"/>
+            </w:rPr>
+          </w:rPrChange>
+        </w:rPr>
+      </w:pPr>
+      <w:ins w:id="1026" w:author="Victor Furlan" w:date="2026-10-15T18:53:00Z" w16du:dateUtc="2026-10-15T17:53:00Z">
+        <w:r>
+          <w:rPr>
+            <w:u w:val="single"/>
+            <w:rPrChange w:id="1027" w:author="Victor Furlan" w:date="2026-10-15T18:55:00Z" w16du:dateUtc="2026-10-15T17:55:00Z">
+              <w:rPr/>
+            </w:rPrChange>
+          </w:rPr>
+          <w:t>Business hypothesis:</w:t>
+        </w:r>
+      </w:ins>
+    </w:p>
+    <w:p>
+      <w:pPr>
+        <w:spacing w:line="278" w:lineRule="auto"/>
+        <w:jc w:val="both"/>
+        <w:rPr>
+          <w:ins w:id="1028" w:author="Victor Furlan" w:date="2026-10-15T18:55:00Z" w16du:dateUtc="2026-10-15T17:55:00Z"/>
+        </w:rPr>
+      </w:pPr>
+      <w:ins w:id="1029" w:author="Victor Furlan" w:date="2026-10-15T18:53:00Z" w16du:dateUtc="2026-10-15T17:53:00Z">
+        <w:r>
+          <w:t>I will investigate whether respondents who place greater importance on the cinema experience, are willing to spend more, and prefer streaming less tend to report more frequent cinema attendance. This is a hypothesis to test, not an assumption that the data must confirm. The findings may support it, partly support it or show a different pattern.</w:t>
+        </w:r>
+      </w:ins>
+    </w:p>
+    <w:p>
+      <w:pPr>
+        <w:spacing w:line="278" w:lineRule="auto"/>
+        <w:jc w:val="both"/>
+        <w:rPr>
+          <w:ins w:id="1030" w:author="Victor Furlan" w:date="2026-10-15T18:53:00Z" w16du:dateUtc="2026-10-15T17:53:00Z"/>
+        </w:rPr>
+      </w:pPr>
+    </w:p>
+    <w:p>
+      <w:pPr>
+        <w:spacing w:line="278" w:lineRule="auto"/>
+        <w:jc w:val="both"/>
+        <w:rPr>
+          <w:ins w:id="1031" w:author="Victor Furlan" w:date="2026-10-15T18:53:00Z" w16du:dateUtc="2026-10-15T17:53:00Z"/>
+          <w:b/>
+          <w:bCs/>
+          <w:rPrChange w:id="1032" w:author="Victor Furlan" w:date="2026-10-15T18:55:00Z" w16du:dateUtc="2026-10-15T17:55:00Z">
+            <w:rPr>
+              <w:ins w:id="1033" w:author="Victor Furlan" w:date="2026-10-15T18:53:00Z" w16du:dateUtc="2026-10-15T17:53:00Z"/>
+            </w:rPr>
+          </w:rPrChange>
+        </w:rPr>
+      </w:pPr>
+      <w:ins w:id="1034" w:author="Victor Furlan" w:date="2026-10-15T18:53:00Z" w16du:dateUtc="2026-10-15T17:53:00Z">
+        <w:r>
+          <w:rPr>
+            <w:b/>
+            <w:bCs/>
+            <w:rPrChange w:id="1035" w:author="Victor Furlan" w:date="2026-10-15T18:55:00Z" w16du:dateUtc="2026-10-15T17:55:00Z">
+              <w:rPr/>
+            </w:rPrChange>
+          </w:rPr>
+          <w:t>4. Scope</w:t>
+        </w:r>
+      </w:ins>
+    </w:p>
+    <w:p>
+      <w:pPr>
+        <w:spacing w:line="278" w:lineRule="auto"/>
+        <w:jc w:val="both"/>
+        <w:rPr>
+          <w:ins w:id="1036" w:author="Victor Furlan" w:date="2026-10-15T18:53:00Z" w16du:dateUtc="2026-10-15T17:53:00Z"/>
+        </w:rPr>
+      </w:pPr>
+      <w:ins w:id="1037" w:author="Victor Furlan" w:date="2026-10-15T18:53:00Z" w16du:dateUtc="2026-10-15T17:53:00Z">
+        <w:r>
+          <w:t>The project will use responses from my 11-question online survey. The questions cover how often respondents visit the cinema, when they last visited, who they usually go with, favourite film genres, reasons for choosing the cinema, spending, the importance of different cinema features, likelihood of attending for a desired film, what might encourage more visits, and preference for streaming or cinema. An open-ended question asks respondents what one change they would make to the cinema experience.</w:t>
+        </w:r>
+      </w:ins>
+    </w:p>
+    <w:p>
+      <w:pPr>
+        <w:spacing w:line="278" w:lineRule="auto"/>
+        <w:jc w:val="both"/>
+        <w:rPr>
+          <w:ins w:id="1038" w:author="Victor Furlan" w:date="2026-10-15T18:53:00Z" w16du:dateUtc="2026-10-15T17:53:00Z"/>
+        </w:rPr>
+      </w:pPr>
+      <w:ins w:id="1039" w:author="Victor Furlan" w:date="2026-10-15T18:53:00Z" w16du:dateUtc="2026-10-15T17:53:00Z">
         <w:r>
           <w:lastRenderedPageBreak/>
-          <w:t>appropriate target classification, such as frequent versus infrequent attendance. This will allow different machine-learning techniques to be compared and evaluated.</w:t>
+          <w:t>The work will include data cleaning, exploratory data analysis, descriptive and comparative analysis, predictive modelling where suitable, visualisations and business recommendations. Python, Jupyter Notebook, Pandas, NumPy are the planned tools.</w:t>
         </w:r>
       </w:ins>
     </w:p>
@@ -8422,20 +8807,38 @@
       <w:pPr>
         <w:spacing w:line="278" w:lineRule="auto"/>
         <w:jc w:val="both"/>
-        <w:pPrChange w:id="991" w:author="Victor Furlan" w:date="2026-10-14T21:26:00Z" w16du:dateUtc="2026-10-14T20:26:00Z">
+        <w:rPr>
+          <w:ins w:id="1040" w:author="Victor Furlan" w:date="2026-10-15T18:53:00Z" w16du:dateUtc="2026-10-15T17:53:00Z"/>
+        </w:rPr>
+      </w:pPr>
+      <w:ins w:id="1041" w:author="Victor Furlan" w:date="2026-10-15T18:53:00Z" w16du:dateUtc="2026-10-15T17:53:00Z">
+        <w:r>
+          <w:t>The target outcome may be grouped into two categories: frequent visitors, defined initially as people who go at least once a month, and infrequent visitors, defined as people who go less often. Before using this grouping, I will check the actual response counts. If the groups are too small or unbalanced for a meaningful comparison, I will explain the issue and adjust the analysis rather than force an unreliable model.</w:t>
+        </w:r>
+      </w:ins>
+    </w:p>
+    <w:p>
+      <w:pPr>
+        <w:spacing w:line="278" w:lineRule="auto"/>
+        <w:jc w:val="both"/>
+        <w:rPr>
+          <w:ins w:id="1042" w:author="Victor Furlan" w:date="2026-10-15T18:53:00Z" w16du:dateUtc="2026-10-15T17:53:00Z"/>
+        </w:rPr>
+      </w:pPr>
+      <w:ins w:id="1043" w:author="Victor Furlan" w:date="2026-10-15T18:53:00Z" w16du:dateUtc="2026-10-15T17:53:00Z">
+        <w:r>
+          <w:t>The project will not predict box-office revenue or the success of individual films, and it will not use confidential records from cinema companies. Its conclusions will be limited by the number and type of people who answer the survey.</w:t>
+        </w:r>
+      </w:ins>
+    </w:p>
+    <w:p>
+      <w:pPr>
+        <w:spacing w:line="278" w:lineRule="auto"/>
+        <w:jc w:val="both"/>
+        <w:pPrChange w:id="1044" w:author="Victor Furlan" w:date="2026-10-14T21:26:00Z" w16du:dateUtc="2026-10-14T20:26:00Z">
           <w:pPr/>
         </w:pPrChange>
       </w:pPr>
-      <w:ins w:id="992" w:author="Victor Furlan" w:date="2026-10-05T17:56:00Z" w16du:dateUtc="2026-10-05T16:56:00Z">
-        <w:r>
-          <w:t>The project therefore moves beyond descriptive statistics by attempting to provide a predictive business tool that could help cinema operators understand customer behaviour and identify factors that may support increased atten</w:t>
-        </w:r>
-      </w:ins>
-      <w:ins w:id="993" w:author="Victor Furlan" w:date="2026-10-14T21:40:00Z" w16du:dateUtc="2026-10-14T20:40:00Z">
-        <w:r>
-          <w:t>dance.</w:t>
-        </w:r>
-      </w:ins>
     </w:p>
     <w:sectPr>
       <w:footerReference w:type="default" r:id="rId16"/>
@@ -8593,6 +8996,92 @@
 <file path=word/numbering.xml><?xml version="1.0" encoding="utf-8"?>
 <w:numbering xmlns:wpc="http://schemas.microsoft.com/office/word/2010/wordprocessingCanvas" xmlns:cx="http://schemas.microsoft.com/office/drawing/2014/chartex" xmlns:cx1="http://schemas.microsoft.com/office/drawing/2015/9/8/chartex" xmlns:cx2="http://schemas.microsoft.com/office/drawing/2015/10/21/chartex" xmlns:cx3="http://schemas.microsoft.com/office/drawing/2016/5/9/chartex" xmlns:cx4="http://schemas.microsoft.com/office/drawing/2016/5/10/chartex" xmlns:cx5="http://schemas.microsoft.com/office/drawing/2016/5/11/chartex" xmlns:cx6="http://schemas.microsoft.com/office/drawing/2016/5/12/chartex" xmlns:cx7="http://schemas.microsoft.com/office/drawing/2016/5/13/chartex" xmlns:cx8="http://schemas.microsoft.com/office/drawing/2016/5/14/chartex" xmlns:mc="http://schemas.openxmlformats.org/markup-compatibility/2006" xmlns:aink="http://schemas.microsoft.com/office/drawing/2016/ink" xmlns:am3d="http://schemas.microsoft.com/office/drawing/2017/model3d" xmlns:o="urn:schemas-microsoft-com:office:office" xmlns:oel="http://schemas.microsoft.com/office/2019/extlst" xmlns:r="http://schemas.openxmlformats.org/officeDocument/2006/relationships" xmlns:m="http://schemas.openxmlformats.org/officeDocument/2006/math" xmlns:v="urn:schemas-microsoft-com:vml" xmlns:wp14="http://schemas.microsoft.com/office/word/2010/wordprocessingDrawing" xmlns:wp="http://schemas.openxmlformats.org/drawingml/2006/wordprocessingDrawing" xmlns:w10="urn:schemas-microsoft-com:office:word" xmlns:w="http://schemas.openxmlformats.org/wordprocessingml/2006/main" xmlns:w14="http://schemas.microsoft.com/office/word/2010/wordml" xmlns:w15="http://schemas.microsoft.com/office/word/2012/wordml" xmlns:w16cex="http://schemas.microsoft.com/office/word/2018/wordml/cex" xmlns:w16cid="http://schemas.microsoft.com/office/word/2016/wordml/cid" xmlns:w16="http://schemas.microsoft.com/office/word/2018/wordml" xmlns:w16du="http://schemas.microsoft.com/office/word/2023/wordml/word16du" xmlns:w16sdtdh="http://schemas.microsoft.com/office/word/2020/wordml/sdtdatahash" xmlns:w16sdtfl="http://schemas.microsoft.com/office/word/2024/wordml/sdtformatlock" xmlns:w16se="http://schemas.microsoft.com/office/word/2015/wordml/symex" xmlns:wpg="http://schemas.microsoft.com/office/word/2010/wordprocessingGroup" xmlns:wpi="http://schemas.microsoft.com/office/word/2010/wordprocessingInk" xmlns:wne="http://schemas.microsoft.com/office/word/2006/wordml" xmlns:wps="http://schemas.microsoft.com/office/word/2010/wordprocessingShape" mc:Ignorable="w14 w15 w16se w16cid w16 w16cex w16sdtdh w16sdtfl w16du wp14">
   <w:abstractNum w:abstractNumId="0" w15:restartNumberingAfterBreak="0">
+    <w:nsid w:val="01BA60FC"/>
+    <w:multiLevelType w:val="hybridMultilevel"/>
+    <w:tmpl w:val="D478874C"/>
+    <w:lvl w:ilvl="0" w:tplc="1809000F">
+      <w:start w:val="1"/>
+      <w:numFmt w:val="decimal"/>
+      <w:lvlText w:val="%1."/>
+      <w:lvlJc w:val="left"/>
+      <w:pPr>
+        <w:ind w:left="1080" w:hanging="360"/>
+      </w:pPr>
+    </w:lvl>
+    <w:lvl w:ilvl="1" w:tplc="18090019" w:tentative="1">
+      <w:start w:val="1"/>
+      <w:numFmt w:val="lowerLetter"/>
+      <w:lvlText w:val="%2."/>
+      <w:lvlJc w:val="left"/>
+      <w:pPr>
+        <w:ind w:left="1800" w:hanging="360"/>
+      </w:pPr>
+    </w:lvl>
+    <w:lvl w:ilvl="2" w:tplc="1809001B" w:tentative="1">
+      <w:start w:val="1"/>
+      <w:numFmt w:val="lowerRoman"/>
+      <w:lvlText w:val="%3."/>
+      <w:lvlJc w:val="right"/>
+      <w:pPr>
+        <w:ind w:left="2520" w:hanging="180"/>
+      </w:pPr>
+    </w:lvl>
+    <w:lvl w:ilvl="3" w:tplc="1809000F" w:tentative="1">
+      <w:start w:val="1"/>
+      <w:numFmt w:val="decimal"/>
+      <w:lvlText w:val="%4."/>
+      <w:lvlJc w:val="left"/>
+      <w:pPr>
+        <w:ind w:left="3240" w:hanging="360"/>
+      </w:pPr>
+    </w:lvl>
+    <w:lvl w:ilvl="4" w:tplc="18090019" w:tentative="1">
+      <w:start w:val="1"/>
+      <w:numFmt w:val="lowerLetter"/>
+      <w:lvlText w:val="%5."/>
+      <w:lvlJc w:val="left"/>
+      <w:pPr>
+        <w:ind w:left="3960" w:hanging="360"/>
+      </w:pPr>
+    </w:lvl>
+    <w:lvl w:ilvl="5" w:tplc="1809001B" w:tentative="1">
+      <w:start w:val="1"/>
+      <w:numFmt w:val="lowerRoman"/>
+      <w:lvlText w:val="%6."/>
+      <w:lvlJc w:val="right"/>
+      <w:pPr>
+        <w:ind w:left="4680" w:hanging="180"/>
+      </w:pPr>
+    </w:lvl>
+    <w:lvl w:ilvl="6" w:tplc="1809000F" w:tentative="1">
+      <w:start w:val="1"/>
+      <w:numFmt w:val="decimal"/>
+      <w:lvlText w:val="%7."/>
+      <w:lvlJc w:val="left"/>
+      <w:pPr>
+        <w:ind w:left="5400" w:hanging="360"/>
+      </w:pPr>
+    </w:lvl>
+    <w:lvl w:ilvl="7" w:tplc="18090019" w:tentative="1">
+      <w:start w:val="1"/>
+      <w:numFmt w:val="lowerLetter"/>
+      <w:lvlText w:val="%8."/>
+      <w:lvlJc w:val="left"/>
+      <w:pPr>
+        <w:ind w:left="6120" w:hanging="360"/>
+      </w:pPr>
+    </w:lvl>
+    <w:lvl w:ilvl="8" w:tplc="1809001B" w:tentative="1">
+      <w:start w:val="1"/>
+      <w:numFmt w:val="lowerRoman"/>
+      <w:lvlText w:val="%9."/>
+      <w:lvlJc w:val="right"/>
+      <w:pPr>
+        <w:ind w:left="6840" w:hanging="180"/>
+      </w:pPr>
+    </w:lvl>
+  </w:abstractNum>
+  <w:abstractNum w:abstractNumId="1" w15:restartNumberingAfterBreak="0">
     <w:nsid w:val="020A7761"/>
     <w:multiLevelType w:val="multilevel"/>
     <w:tmpl w:val="32F426CA"/>
@@ -8741,7 +9230,7 @@
       </w:rPr>
     </w:lvl>
   </w:abstractNum>
-  <w:abstractNum w:abstractNumId="1" w15:restartNumberingAfterBreak="0">
+  <w:abstractNum w:abstractNumId="2" w15:restartNumberingAfterBreak="0">
     <w:nsid w:val="097C7BB4"/>
     <w:multiLevelType w:val="hybridMultilevel"/>
     <w:tmpl w:val="1A0CB90E"/>
@@ -8854,7 +9343,7 @@
       </w:rPr>
     </w:lvl>
   </w:abstractNum>
-  <w:abstractNum w:abstractNumId="2" w15:restartNumberingAfterBreak="0">
+  <w:abstractNum w:abstractNumId="3" w15:restartNumberingAfterBreak="0">
     <w:nsid w:val="0DD562D6"/>
     <w:multiLevelType w:val="multilevel"/>
     <w:tmpl w:val="E848B3BC"/>
@@ -8967,7 +9456,7 @@
       </w:pPr>
     </w:lvl>
   </w:abstractNum>
-  <w:abstractNum w:abstractNumId="3" w15:restartNumberingAfterBreak="0">
+  <w:abstractNum w:abstractNumId="4" w15:restartNumberingAfterBreak="0">
     <w:nsid w:val="14554198"/>
     <w:multiLevelType w:val="hybridMultilevel"/>
     <w:tmpl w:val="9D487BE0"/>
@@ -9080,7 +9569,7 @@
       </w:rPr>
     </w:lvl>
   </w:abstractNum>
-  <w:abstractNum w:abstractNumId="4" w15:restartNumberingAfterBreak="0">
+  <w:abstractNum w:abstractNumId="5" w15:restartNumberingAfterBreak="0">
     <w:nsid w:val="1B107B77"/>
     <w:multiLevelType w:val="multilevel"/>
     <w:tmpl w:val="CDD27A46"/>
@@ -9229,7 +9718,7 @@
       </w:rPr>
     </w:lvl>
   </w:abstractNum>
-  <w:abstractNum w:abstractNumId="5" w15:restartNumberingAfterBreak="0">
+  <w:abstractNum w:abstractNumId="6" w15:restartNumberingAfterBreak="0">
     <w:nsid w:val="369E1916"/>
     <w:multiLevelType w:val="multilevel"/>
     <w:tmpl w:val="4A4EF378"/>
@@ -9378,7 +9867,93 @@
       </w:rPr>
     </w:lvl>
   </w:abstractNum>
-  <w:abstractNum w:abstractNumId="6" w15:restartNumberingAfterBreak="0">
+  <w:abstractNum w:abstractNumId="7" w15:restartNumberingAfterBreak="0">
+    <w:nsid w:val="4300107D"/>
+    <w:multiLevelType w:val="hybridMultilevel"/>
+    <w:tmpl w:val="628A9E88"/>
+    <w:lvl w:ilvl="0" w:tplc="1809000F">
+      <w:start w:val="1"/>
+      <w:numFmt w:val="decimal"/>
+      <w:lvlText w:val="%1."/>
+      <w:lvlJc w:val="left"/>
+      <w:pPr>
+        <w:ind w:left="720" w:hanging="360"/>
+      </w:pPr>
+    </w:lvl>
+    <w:lvl w:ilvl="1" w:tplc="18090019" w:tentative="1">
+      <w:start w:val="1"/>
+      <w:numFmt w:val="lowerLetter"/>
+      <w:lvlText w:val="%2."/>
+      <w:lvlJc w:val="left"/>
+      <w:pPr>
+        <w:ind w:left="1440" w:hanging="360"/>
+      </w:pPr>
+    </w:lvl>
+    <w:lvl w:ilvl="2" w:tplc="1809001B" w:tentative="1">
+      <w:start w:val="1"/>
+      <w:numFmt w:val="lowerRoman"/>
+      <w:lvlText w:val="%3."/>
+      <w:lvlJc w:val="right"/>
+      <w:pPr>
+        <w:ind w:left="2160" w:hanging="180"/>
+      </w:pPr>
+    </w:lvl>
+    <w:lvl w:ilvl="3" w:tplc="1809000F" w:tentative="1">
+      <w:start w:val="1"/>
+      <w:numFmt w:val="decimal"/>
+      <w:lvlText w:val="%4."/>
+      <w:lvlJc w:val="left"/>
+      <w:pPr>
+        <w:ind w:left="2880" w:hanging="360"/>
+      </w:pPr>
+    </w:lvl>
+    <w:lvl w:ilvl="4" w:tplc="18090019" w:tentative="1">
+      <w:start w:val="1"/>
+      <w:numFmt w:val="lowerLetter"/>
+      <w:lvlText w:val="%5."/>
+      <w:lvlJc w:val="left"/>
+      <w:pPr>
+        <w:ind w:left="3600" w:hanging="360"/>
+      </w:pPr>
+    </w:lvl>
+    <w:lvl w:ilvl="5" w:tplc="1809001B" w:tentative="1">
+      <w:start w:val="1"/>
+      <w:numFmt w:val="lowerRoman"/>
+      <w:lvlText w:val="%6."/>
+      <w:lvlJc w:val="right"/>
+      <w:pPr>
+        <w:ind w:left="4320" w:hanging="180"/>
+      </w:pPr>
+    </w:lvl>
+    <w:lvl w:ilvl="6" w:tplc="1809000F" w:tentative="1">
+      <w:start w:val="1"/>
+      <w:numFmt w:val="decimal"/>
+      <w:lvlText w:val="%7."/>
+      <w:lvlJc w:val="left"/>
+      <w:pPr>
+        <w:ind w:left="5040" w:hanging="360"/>
+      </w:pPr>
+    </w:lvl>
+    <w:lvl w:ilvl="7" w:tplc="18090019" w:tentative="1">
+      <w:start w:val="1"/>
+      <w:numFmt w:val="lowerLetter"/>
+      <w:lvlText w:val="%8."/>
+      <w:lvlJc w:val="left"/>
+      <w:pPr>
+        <w:ind w:left="5760" w:hanging="360"/>
+      </w:pPr>
+    </w:lvl>
+    <w:lvl w:ilvl="8" w:tplc="1809001B" w:tentative="1">
+      <w:start w:val="1"/>
+      <w:numFmt w:val="lowerRoman"/>
+      <w:lvlText w:val="%9."/>
+      <w:lvlJc w:val="right"/>
+      <w:pPr>
+        <w:ind w:left="6480" w:hanging="180"/>
+      </w:pPr>
+    </w:lvl>
+  </w:abstractNum>
+  <w:abstractNum w:abstractNumId="8" w15:restartNumberingAfterBreak="0">
     <w:nsid w:val="675573C9"/>
     <w:multiLevelType w:val="multilevel"/>
     <w:tmpl w:val="57D27894"/>
@@ -9527,7 +10102,96 @@
       </w:rPr>
     </w:lvl>
   </w:abstractNum>
-  <w:abstractNum w:abstractNumId="7" w15:restartNumberingAfterBreak="0">
+  <w:abstractNum w:abstractNumId="9" w15:restartNumberingAfterBreak="0">
+    <w:nsid w:val="787A28CC"/>
+    <w:multiLevelType w:val="hybridMultilevel"/>
+    <w:tmpl w:val="8B76CB2E"/>
+    <w:lvl w:ilvl="0" w:tplc="1809000F">
+      <w:start w:val="1"/>
+      <w:numFmt w:val="decimal"/>
+      <w:lvlText w:val="%1."/>
+      <w:lvlJc w:val="left"/>
+      <w:pPr>
+        <w:ind w:left="720" w:hanging="360"/>
+      </w:pPr>
+      <w:rPr>
+        <w:rFonts w:hint="default"/>
+      </w:rPr>
+    </w:lvl>
+    <w:lvl w:ilvl="1" w:tplc="18090019" w:tentative="1">
+      <w:start w:val="1"/>
+      <w:numFmt w:val="lowerLetter"/>
+      <w:lvlText w:val="%2."/>
+      <w:lvlJc w:val="left"/>
+      <w:pPr>
+        <w:ind w:left="1440" w:hanging="360"/>
+      </w:pPr>
+    </w:lvl>
+    <w:lvl w:ilvl="2" w:tplc="1809001B" w:tentative="1">
+      <w:start w:val="1"/>
+      <w:numFmt w:val="lowerRoman"/>
+      <w:lvlText w:val="%3."/>
+      <w:lvlJc w:val="right"/>
+      <w:pPr>
+        <w:ind w:left="2160" w:hanging="180"/>
+      </w:pPr>
+    </w:lvl>
+    <w:lvl w:ilvl="3" w:tplc="1809000F" w:tentative="1">
+      <w:start w:val="1"/>
+      <w:numFmt w:val="decimal"/>
+      <w:lvlText w:val="%4."/>
+      <w:lvlJc w:val="left"/>
+      <w:pPr>
+        <w:ind w:left="2880" w:hanging="360"/>
+      </w:pPr>
+    </w:lvl>
+    <w:lvl w:ilvl="4" w:tplc="18090019" w:tentative="1">
+      <w:start w:val="1"/>
+      <w:numFmt w:val="lowerLetter"/>
+      <w:lvlText w:val="%5."/>
+      <w:lvlJc w:val="left"/>
+      <w:pPr>
+        <w:ind w:left="3600" w:hanging="360"/>
+      </w:pPr>
+    </w:lvl>
+    <w:lvl w:ilvl="5" w:tplc="1809001B" w:tentative="1">
+      <w:start w:val="1"/>
+      <w:numFmt w:val="lowerRoman"/>
+      <w:lvlText w:val="%6."/>
+      <w:lvlJc w:val="right"/>
+      <w:pPr>
+        <w:ind w:left="4320" w:hanging="180"/>
+      </w:pPr>
+    </w:lvl>
+    <w:lvl w:ilvl="6" w:tplc="1809000F" w:tentative="1">
+      <w:start w:val="1"/>
+      <w:numFmt w:val="decimal"/>
+      <w:lvlText w:val="%7."/>
+      <w:lvlJc w:val="left"/>
+      <w:pPr>
+        <w:ind w:left="5040" w:hanging="360"/>
+      </w:pPr>
+    </w:lvl>
+    <w:lvl w:ilvl="7" w:tplc="18090019" w:tentative="1">
+      <w:start w:val="1"/>
+      <w:numFmt w:val="lowerLetter"/>
+      <w:lvlText w:val="%8."/>
+      <w:lvlJc w:val="left"/>
+      <w:pPr>
+        <w:ind w:left="5760" w:hanging="360"/>
+      </w:pPr>
+    </w:lvl>
+    <w:lvl w:ilvl="8" w:tplc="1809001B" w:tentative="1">
+      <w:start w:val="1"/>
+      <w:numFmt w:val="lowerRoman"/>
+      <w:lvlText w:val="%9."/>
+      <w:lvlJc w:val="right"/>
+      <w:pPr>
+        <w:ind w:left="6480" w:hanging="180"/>
+      </w:pPr>
+    </w:lvl>
+  </w:abstractNum>
+  <w:abstractNum w:abstractNumId="10" w15:restartNumberingAfterBreak="0">
     <w:nsid w:val="7A490A53"/>
     <w:multiLevelType w:val="multilevel"/>
     <w:tmpl w:val="9EA23756"/>
@@ -9677,25 +10341,25 @@
     </w:lvl>
   </w:abstractNum>
   <w:num w:numId="1" w16cid:durableId="243073450">
-    <w:abstractNumId w:val="3"/>
+    <w:abstractNumId w:val="4"/>
   </w:num>
   <w:num w:numId="2" w16cid:durableId="800072569">
+    <w:abstractNumId w:val="2"/>
+  </w:num>
+  <w:num w:numId="3" w16cid:durableId="728696014">
+    <w:abstractNumId w:val="8"/>
+  </w:num>
+  <w:num w:numId="4" w16cid:durableId="1057824889">
     <w:abstractNumId w:val="1"/>
   </w:num>
-  <w:num w:numId="3" w16cid:durableId="728696014">
-    <w:abstractNumId w:val="6"/>
-  </w:num>
-  <w:num w:numId="4" w16cid:durableId="1057824889">
-    <w:abstractNumId w:val="0"/>
-  </w:num>
   <w:num w:numId="5" w16cid:durableId="716047706">
-    <w:abstractNumId w:val="7"/>
+    <w:abstractNumId w:val="10"/>
   </w:num>
   <w:num w:numId="6" w16cid:durableId="720325003">
-    <w:abstractNumId w:val="4"/>
+    <w:abstractNumId w:val="5"/>
   </w:num>
   <w:num w:numId="7" w16cid:durableId="2060976238">
-    <w:abstractNumId w:val="2"/>
+    <w:abstractNumId w:val="3"/>
     <w:lvlOverride w:ilvl="0">
       <w:startOverride w:val="1"/>
     </w:lvlOverride>
@@ -9725,7 +10389,16 @@
     </w:lvlOverride>
   </w:num>
   <w:num w:numId="8" w16cid:durableId="208693188">
-    <w:abstractNumId w:val="5"/>
+    <w:abstractNumId w:val="6"/>
+  </w:num>
+  <w:num w:numId="9" w16cid:durableId="923999448">
+    <w:abstractNumId w:val="7"/>
+  </w:num>
+  <w:num w:numId="10" w16cid:durableId="773479818">
+    <w:abstractNumId w:val="9"/>
+  </w:num>
+  <w:num w:numId="11" w16cid:durableId="2055806660">
+    <w:abstractNumId w:val="0"/>
   </w:num>
 </w:numbering>
 </file>
@@ -11154,29 +11827,6 @@
 </file>
 
 <file path=customXml/item2.xml><?xml version="1.0" encoding="utf-8"?>
-<?mso-contentType ?>
-<FormTemplates xmlns="http://schemas.microsoft.com/sharepoint/v3/contenttype/forms">
-  <Display>DocumentLibraryForm</Display>
-  <Edit>DocumentLibraryForm</Edit>
-  <New>DocumentLibraryForm</New>
-</FormTemplates>
-</file>
-
-<file path=customXml/item3.xml><?xml version="1.0" encoding="utf-8"?>
-<p:properties xmlns:p="http://schemas.microsoft.com/office/2006/metadata/properties" xmlns:xsi="http://www.w3.org/2001/XMLSchema-instance" xmlns:pc="http://schemas.microsoft.com/office/infopath/2007/PartnerControls">
-  <documentManagement>
-    <_activity xmlns="b16a9495-4dfd-42d3-807b-98cb11f03b43" xsi:nil="true"/>
-  </documentManagement>
-</p:properties>
-</file>
-
-<file path=customXml/item4.xml><?xml version="1.0" encoding="utf-8"?>
-<go:gDocsCustomXmlDataStorage xmlns:go="http://customooxmlschemas.google.com/" xmlns:r="http://schemas.openxmlformats.org/officeDocument/2006/relationships" uri="GoogleDocsCustomDataVersion2">
-  <go:docsCustomData xmlns:go="http://customooxmlschemas.google.com/" roundtripDataSignature="AMtx7miehlgh2pzFvkmpnhkVaeODs3Wnuw==">CgMxLjAyCGguZ2pkZ3hzMgloLjMwajB6bGwyCWguMWZvYjl0ZTIJaC4zem55c2g3MgloLjJldDkycDAyDmgua2ZranMzcndsMmMxOAByITF6bEVRVXYyWkdtTjZWemdfYk5uaGpmb0x1c2hhYUo3dw==</go:docsCustomData>
-</go:gDocsCustomXmlDataStorage>
-</file>
-
-<file path=customXml/item5.xml><?xml version="1.0" encoding="utf-8"?>
 <ct:contentTypeSchema xmlns:ct="http://schemas.microsoft.com/office/2006/metadata/contentType" xmlns:ma="http://schemas.microsoft.com/office/2006/metadata/properties/metaAttributes" ct:_="" ma:_="" ma:contentTypeName="Document" ma:contentTypeID="0x01010091CA7052A48FB44E8BAE44044031FC77" ma:contentTypeVersion="5" ma:contentTypeDescription="Create a new document." ma:contentTypeScope="" ma:versionID="72110da391d7bf7bbbd9879cda66318c">
   <xsd:schema xmlns:xsd="http://www.w3.org/2001/XMLSchema" xmlns:xs="http://www.w3.org/2001/XMLSchema" xmlns:p="http://schemas.microsoft.com/office/2006/metadata/properties" xmlns:ns3="b16a9495-4dfd-42d3-807b-98cb11f03b43" targetNamespace="http://schemas.microsoft.com/office/2006/metadata/properties" ma:root="true" ma:fieldsID="65d4c4ab10123b5e2192ffab3149626d" ns3:_="">
     <xsd:import namespace="b16a9495-4dfd-42d3-807b-98cb11f03b43"/>
@@ -11326,6 +11976,29 @@
 </ct:contentTypeSchema>
 </file>
 
+<file path=customXml/item3.xml><?xml version="1.0" encoding="utf-8"?>
+<go:gDocsCustomXmlDataStorage xmlns:go="http://customooxmlschemas.google.com/" xmlns:r="http://schemas.openxmlformats.org/officeDocument/2006/relationships" uri="GoogleDocsCustomDataVersion2">
+  <go:docsCustomData xmlns:go="http://customooxmlschemas.google.com/" roundtripDataSignature="AMtx7miehlgh2pzFvkmpnhkVaeODs3Wnuw==">CgMxLjAyCGguZ2pkZ3hzMgloLjMwajB6bGwyCWguMWZvYjl0ZTIJaC4zem55c2g3MgloLjJldDkycDAyDmgua2ZranMzcndsMmMxOAByITF6bEVRVXYyWkdtTjZWemdfYk5uaGpmb0x1c2hhYUo3dw==</go:docsCustomData>
+</go:gDocsCustomXmlDataStorage>
+</file>
+
+<file path=customXml/item4.xml><?xml version="1.0" encoding="utf-8"?>
+<p:properties xmlns:p="http://schemas.microsoft.com/office/2006/metadata/properties" xmlns:xsi="http://www.w3.org/2001/XMLSchema-instance" xmlns:pc="http://schemas.microsoft.com/office/infopath/2007/PartnerControls">
+  <documentManagement>
+    <_activity xmlns="b16a9495-4dfd-42d3-807b-98cb11f03b43" xsi:nil="true"/>
+  </documentManagement>
+</p:properties>
+</file>
+
+<file path=customXml/item5.xml><?xml version="1.0" encoding="utf-8"?>
+<?mso-contentType ?>
+<FormTemplates xmlns="http://schemas.microsoft.com/sharepoint/v3/contenttype/forms">
+  <Display>DocumentLibraryForm</Display>
+  <Edit>DocumentLibraryForm</Edit>
+  <New>DocumentLibraryForm</New>
+</FormTemplates>
+</file>
+
 <file path=customXml/itemProps1.xml><?xml version="1.0" encoding="utf-8"?>
 <ds:datastoreItem xmlns:ds="http://schemas.openxmlformats.org/officeDocument/2006/customXml" ds:itemID="{A5C61161-19E4-4D42-A5DA-EC591AFE0A7D}">
   <ds:schemaRefs>
@@ -11335,33 +12008,6 @@
 </file>
 
 <file path=customXml/itemProps2.xml><?xml version="1.0" encoding="utf-8"?>
-<ds:datastoreItem xmlns:ds="http://schemas.openxmlformats.org/officeDocument/2006/customXml" ds:itemID="{AD64260C-1345-4C21-A804-B9FBE7B91489}">
-  <ds:schemaRefs>
-    <ds:schemaRef ds:uri="http://schemas.microsoft.com/sharepoint/v3/contenttype/forms"/>
-  </ds:schemaRefs>
-</ds:datastoreItem>
-</file>
-
-<file path=customXml/itemProps3.xml><?xml version="1.0" encoding="utf-8"?>
-<ds:datastoreItem xmlns:ds="http://schemas.openxmlformats.org/officeDocument/2006/customXml" ds:itemID="{D51EB97A-8C7A-4EE1-A3AD-E57FDBFA6BEE}">
-  <ds:schemaRefs>
-    <ds:schemaRef ds:uri="http://schemas.microsoft.com/office/2006/metadata/properties"/>
-    <ds:schemaRef ds:uri="http://schemas.microsoft.com/office/infopath/2007/PartnerControls"/>
-    <ds:schemaRef ds:uri="b16a9495-4dfd-42d3-807b-98cb11f03b43"/>
-  </ds:schemaRefs>
-</ds:datastoreItem>
-</file>
-
-<file path=customXml/itemProps4.xml><?xml version="1.0" encoding="utf-8"?>
-<ds:datastoreItem xmlns:ds="http://schemas.openxmlformats.org/officeDocument/2006/customXml" ds:itemID="{11111111-1234-1234-1234-123412341234}">
-  <ds:schemaRefs>
-    <ds:schemaRef ds:uri="http://customooxmlschemas.google.com/"/>
-    <ds:schemaRef ds:uri="http://schemas.openxmlformats.org/officeDocument/2006/relationships"/>
-  </ds:schemaRefs>
-</ds:datastoreItem>
-</file>
-
-<file path=customXml/itemProps5.xml><?xml version="1.0" encoding="utf-8"?>
 <ds:datastoreItem xmlns:ds="http://schemas.openxmlformats.org/officeDocument/2006/customXml" ds:itemID="{1CD39011-2B34-4226-8638-59B13D86301D}">
   <ds:schemaRefs>
     <ds:schemaRef ds:uri="http://schemas.microsoft.com/office/2006/metadata/contentType"/>
@@ -11377,4 +12023,31 @@
     <ds:schemaRef ds:uri="http://schemas.microsoft.com/internal/obd"/>
   </ds:schemaRefs>
 </ds:datastoreItem>
+</file>
+
+<file path=customXml/itemProps3.xml><?xml version="1.0" encoding="utf-8"?>
+<ds:datastoreItem xmlns:ds="http://schemas.openxmlformats.org/officeDocument/2006/customXml" ds:itemID="{11111111-1234-1234-1234-123412341234}">
+  <ds:schemaRefs>
+    <ds:schemaRef ds:uri="http://customooxmlschemas.google.com/"/>
+    <ds:schemaRef ds:uri="http://schemas.openxmlformats.org/officeDocument/2006/relationships"/>
+  </ds:schemaRefs>
+</ds:datastoreItem>
+</file>
+
+<file path=customXml/itemProps4.xml><?xml version="1.0" encoding="utf-8"?>
+<ds:datastoreItem xmlns:ds="http://schemas.openxmlformats.org/officeDocument/2006/customXml" ds:itemID="{D51EB97A-8C7A-4EE1-A3AD-E57FDBFA6BEE}">
+  <ds:schemaRefs>
+    <ds:schemaRef ds:uri="http://schemas.microsoft.com/office/2006/metadata/properties"/>
+    <ds:schemaRef ds:uri="http://schemas.microsoft.com/office/infopath/2007/PartnerControls"/>
+    <ds:schemaRef ds:uri="b16a9495-4dfd-42d3-807b-98cb11f03b43"/>
+  </ds:schemaRefs>
+</ds:datastoreItem>
+</file>
+
+<file path=customXml/itemProps5.xml><?xml version="1.0" encoding="utf-8"?>
+<ds:datastoreItem xmlns:ds="http://schemas.openxmlformats.org/officeDocument/2006/customXml" ds:itemID="{AD64260C-1345-4C21-A804-B9FBE7B91489}">
+  <ds:schemaRefs>
+    <ds:schemaRef ds:uri="http://schemas.microsoft.com/sharepoint/v3/contenttype/forms"/>
+  </ds:schemaRefs>
+</ds:datastoreItem>
 </file>
</xml_diff>

<commit_message>
Data Sources and Access
Describing the Data source and Access
</commit_message>
<xml_diff>
--- a/CA1 - Capstone Project Proposal - Strategic Thinking.docx
+++ b/CA1 - Capstone Project Proposal - Strategic Thinking.docx
@@ -789,6 +789,7 @@
                 <w:szCs w:val="32"/>
               </w:rPr>
             </w:pPr>
+            <w:proofErr w:type="spellStart"/>
             <w:ins w:id="29" w:author="Victor Furlan" w:date="2026-10-05T18:11:00Z" w16du:dateUtc="2026-10-05T17:11:00Z">
               <w:r>
                 <w:rPr>
@@ -797,7 +798,17 @@
                   <w:sz w:val="32"/>
                   <w:szCs w:val="32"/>
                 </w:rPr>
-                <w:t>Taufique Ahmed</w:t>
+                <w:t>Taufique</w:t>
+              </w:r>
+              <w:proofErr w:type="spellEnd"/>
+              <w:r>
+                <w:rPr>
+                  <w:i/>
+                  <w:color w:val="156082"/>
+                  <w:sz w:val="32"/>
+                  <w:szCs w:val="32"/>
+                </w:rPr>
+                <w:t xml:space="preserve"> Ahmed</w:t>
               </w:r>
             </w:ins>
             <w:ins w:id="30" w:author="naomie mboma" w:date="2026-04-19T22:10:00Z" w16du:dateUtc="2026-04-19T21:10:00Z">
@@ -1389,7 +1400,23 @@
                                 <w:color w:val="000000"/>
                                 <w:sz w:val="28"/>
                               </w:rPr>
-                              <w:t xml:space="preserve">By submitting this assessment, I confirm that I have read the CCT policy on academic misconduct and understand the implications of submitting work that is not my own or does not appropriately reference material taken from a third party or other source. </w:t>
+                              <w:t xml:space="preserve">By submitting this assessment, I confirm that I have read the CCT policy on academic misconduct and understand the implications of submitting work that is not my own or does not appropriately reference material </w:t>
+                            </w:r>
+                            <w:proofErr w:type="gramStart"/>
+                            <w:r>
+                              <w:rPr>
+                                <w:color w:val="000000"/>
+                                <w:sz w:val="28"/>
+                              </w:rPr>
+                              <w:t>taken</w:t>
+                            </w:r>
+                            <w:proofErr w:type="gramEnd"/>
+                            <w:r>
+                              <w:rPr>
+                                <w:color w:val="000000"/>
+                                <w:sz w:val="28"/>
+                              </w:rPr>
+                              <w:t xml:space="preserve"> from a third party or other source. </w:t>
                             </w:r>
                           </w:p>
                           <w:p>
@@ -1459,7 +1486,23 @@
                           <w:color w:val="000000"/>
                           <w:sz w:val="28"/>
                         </w:rPr>
-                        <w:t xml:space="preserve">By submitting this assessment, I confirm that I have read the CCT policy on academic misconduct and understand the implications of submitting work that is not my own or does not appropriately reference material taken from a third party or other source. </w:t>
+                        <w:t xml:space="preserve">By submitting this assessment, I confirm that I have read the CCT policy on academic misconduct and understand the implications of submitting work that is not my own or does not appropriately reference material </w:t>
+                      </w:r>
+                      <w:proofErr w:type="gramStart"/>
+                      <w:r>
+                        <w:rPr>
+                          <w:color w:val="000000"/>
+                          <w:sz w:val="28"/>
+                        </w:rPr>
+                        <w:t>taken</w:t>
+                      </w:r>
+                      <w:proofErr w:type="gramEnd"/>
+                      <w:r>
+                        <w:rPr>
+                          <w:color w:val="000000"/>
+                          <w:sz w:val="28"/>
+                        </w:rPr>
+                        <w:t xml:space="preserve"> from a third party or other source. </w:t>
                       </w:r>
                     </w:p>
                     <w:p>
@@ -8352,7 +8395,15 @@
       </w:pPr>
       <w:ins w:id="980" w:author="Victor Furlan" w:date="2026-10-05T17:56:00Z" w16du:dateUtc="2026-10-05T16:56:00Z">
         <w:r>
-          <w:t>Cinema businesses need to understand changing consumer behaviour in order to attract and retain customers. A consumer may choose to visit the cinema because of the quality of the experience, a particular movie release or the social aspect of going with friends or family. Conversely, high prices, convenience of streaming services, location or other factors may discourage cinema attendance.</w:t>
+          <w:t xml:space="preserve">Cinema businesses need to understand changing consumer behaviour </w:t>
+        </w:r>
+        <w:proofErr w:type="gramStart"/>
+        <w:r>
+          <w:t>in order to</w:t>
+        </w:r>
+        <w:proofErr w:type="gramEnd"/>
+        <w:r>
+          <w:t xml:space="preserve"> attract and retain customers. A consumer may choose to visit the cinema because of the quality of the experience, a particular movie release or the social aspect of going with friends or family. Conversely, high prices, convenience of streaming services, location or other factors may discourage cinema attendance.</w:t>
         </w:r>
       </w:ins>
     </w:p>
@@ -9073,13 +9124,389 @@
         </w:numPr>
         <w:spacing w:line="278" w:lineRule="auto"/>
         <w:jc w:val="both"/>
-        <w:pPrChange w:id="1088" w:author="Victor Furlan" w:date="2026-10-16T21:21:00Z" w16du:dateUtc="2026-10-16T20:21:00Z">
+        <w:rPr>
+          <w:ins w:id="1088" w:author="Victor Furlan" w:date="2026-10-20T21:50:00Z" w16du:dateUtc="2026-10-20T20:50:00Z"/>
+        </w:rPr>
+      </w:pPr>
+      <w:ins w:id="1089" w:author="Victor Furlan" w:date="2026-10-16T21:21:00Z" w16du:dateUtc="2026-10-16T20:21:00Z">
+        <w:r>
+          <w:t>ADD PICTURE</w:t>
+        </w:r>
+      </w:ins>
+    </w:p>
+    <w:p>
+      <w:pPr>
+        <w:spacing w:line="278" w:lineRule="auto"/>
+        <w:jc w:val="both"/>
+        <w:rPr>
+          <w:ins w:id="1090" w:author="Victor Furlan" w:date="2026-10-20T21:50:00Z" w16du:dateUtc="2026-10-20T20:50:00Z"/>
+        </w:rPr>
+      </w:pPr>
+    </w:p>
+    <w:p>
+      <w:pPr>
+        <w:spacing w:line="278" w:lineRule="auto"/>
+        <w:jc w:val="both"/>
+        <w:rPr>
+          <w:ins w:id="1091" w:author="Victor Furlan" w:date="2026-10-20T21:50:00Z" w16du:dateUtc="2026-10-20T20:50:00Z"/>
+        </w:rPr>
+      </w:pPr>
+    </w:p>
+    <w:p>
+      <w:pPr>
+        <w:spacing w:line="278" w:lineRule="auto"/>
+        <w:jc w:val="both"/>
+        <w:rPr>
+          <w:ins w:id="1092" w:author="Victor Furlan" w:date="2026-10-20T21:51:00Z" w16du:dateUtc="2026-10-20T20:51:00Z"/>
+        </w:rPr>
+      </w:pPr>
+      <w:ins w:id="1093" w:author="Victor Furlan" w:date="2026-10-20T21:51:00Z" w16du:dateUtc="2026-10-20T20:51:00Z">
+        <w:r>
+          <w:t>Jupyter Notebook will allow me to keep code, explanations, calculations and charts together so that the analysis can be checked and repeated.</w:t>
+        </w:r>
+      </w:ins>
+    </w:p>
+    <w:p>
+      <w:pPr>
+        <w:spacing w:line="278" w:lineRule="auto"/>
+        <w:jc w:val="both"/>
+        <w:rPr>
+          <w:ins w:id="1094" w:author="Victor Furlan" w:date="2026-10-20T21:51:00Z" w16du:dateUtc="2026-10-20T20:51:00Z"/>
+          <w:b/>
+          <w:bCs/>
+          <w:rPrChange w:id="1095" w:author="Victor Furlan" w:date="2026-10-20T21:53:00Z" w16du:dateUtc="2026-10-20T20:53:00Z">
+            <w:rPr>
+              <w:ins w:id="1096" w:author="Victor Furlan" w:date="2026-10-20T21:51:00Z" w16du:dateUtc="2026-10-20T20:51:00Z"/>
+            </w:rPr>
+          </w:rPrChange>
+        </w:rPr>
+      </w:pPr>
+      <w:ins w:id="1097" w:author="Victor Furlan" w:date="2026-10-20T21:51:00Z" w16du:dateUtc="2026-10-20T20:51:00Z">
+        <w:r>
+          <w:rPr>
+            <w:b/>
+            <w:bCs/>
+            <w:rPrChange w:id="1098" w:author="Victor Furlan" w:date="2026-10-20T21:53:00Z" w16du:dateUtc="2026-10-20T20:53:00Z">
+              <w:rPr/>
+            </w:rPrChange>
+          </w:rPr>
+          <w:t>6. Data Sources and Access</w:t>
+        </w:r>
+      </w:ins>
+    </w:p>
+    <w:p>
+      <w:pPr>
+        <w:spacing w:line="278" w:lineRule="auto"/>
+        <w:jc w:val="both"/>
+        <w:rPr>
+          <w:ins w:id="1099" w:author="Victor Furlan" w:date="2026-10-20T21:51:00Z" w16du:dateUtc="2026-10-20T20:51:00Z"/>
+        </w:rPr>
+      </w:pPr>
+      <w:ins w:id="1100" w:author="Victor Furlan" w:date="2026-10-20T21:51:00Z" w16du:dateUtc="2026-10-20T20:51:00Z">
+        <w:r>
+          <w:t>The main source will be primary data collected through my own 11-question online survey. I will aim for at least 100 valid responses, although this is a target rather than a guaranteed sample size. The survey is being shared mainly with college classmates and other available respondents, so it uses convenience sampling. This means that the sample may not represent the wider Irish population or all cinema customers.</w:t>
+        </w:r>
+      </w:ins>
+    </w:p>
+    <w:p>
+      <w:pPr>
+        <w:spacing w:line="278" w:lineRule="auto"/>
+        <w:jc w:val="both"/>
+        <w:rPr>
+          <w:ins w:id="1101" w:author="Victor Furlan" w:date="2026-10-20T21:51:00Z" w16du:dateUtc="2026-10-20T20:51:00Z"/>
+        </w:rPr>
+      </w:pPr>
+      <w:ins w:id="1102" w:author="Victor Furlan" w:date="2026-10-20T21:51:00Z" w16du:dateUtc="2026-10-20T20:51:00Z">
+        <w:r>
+          <w:t>The dataset will include categorical answers, 1–5 ratings and short open-ended comments. The attendance-frequency question will be the outcome for the proposed classification task; suitable answers about spending, streaming and cinema preferences may be used as predictors. I will report the actual sample size and the number of respondents in each attendance group before modelling.</w:t>
+        </w:r>
+      </w:ins>
+    </w:p>
+    <w:p>
+      <w:pPr>
+        <w:spacing w:line="278" w:lineRule="auto"/>
+        <w:jc w:val="both"/>
+        <w:rPr>
+          <w:ins w:id="1103" w:author="Victor Furlan" w:date="2026-10-20T21:51:00Z" w16du:dateUtc="2026-10-20T20:51:00Z"/>
+        </w:rPr>
+      </w:pPr>
+      <w:ins w:id="1104" w:author="Victor Furlan" w:date="2026-10-20T21:51:00Z" w16du:dateUtc="2026-10-20T20:51:00Z">
+        <w:r>
+          <w:t>I will use the responses only for this academic project and will not use confidential company data. Before collecting or analysing responses, I will follow the CCT College ethics process and check that the survey introduction explains the purpose of the project, voluntary participation and how the data will be used. Access to the raw data will be restricted to the extent possible, and the public GitHub repository will contain code and non-identifying materials only—not raw responses or any personal information.</w:t>
+        </w:r>
+      </w:ins>
+    </w:p>
+    <w:p>
+      <w:pPr>
+        <w:spacing w:line="278" w:lineRule="auto"/>
+        <w:jc w:val="both"/>
+        <w:rPr>
+          <w:ins w:id="1105" w:author="Victor Furlan" w:date="2026-10-20T21:51:00Z" w16du:dateUtc="2026-10-20T20:51:00Z"/>
+          <w:b/>
+          <w:bCs/>
+          <w:rPrChange w:id="1106" w:author="Victor Furlan" w:date="2026-10-20T21:53:00Z" w16du:dateUtc="2026-10-20T20:53:00Z">
+            <w:rPr>
+              <w:ins w:id="1107" w:author="Victor Furlan" w:date="2026-10-20T21:51:00Z" w16du:dateUtc="2026-10-20T20:51:00Z"/>
+            </w:rPr>
+          </w:rPrChange>
+        </w:rPr>
+      </w:pPr>
+      <w:ins w:id="1108" w:author="Victor Furlan" w:date="2026-10-20T21:51:00Z" w16du:dateUtc="2026-10-20T20:51:00Z">
+        <w:r>
+          <w:rPr>
+            <w:b/>
+            <w:bCs/>
+            <w:rPrChange w:id="1109" w:author="Victor Furlan" w:date="2026-10-20T21:53:00Z" w16du:dateUtc="2026-10-20T20:53:00Z">
+              <w:rPr/>
+            </w:rPrChange>
+          </w:rPr>
+          <w:t>7. Expected Deliverables</w:t>
+        </w:r>
+      </w:ins>
+    </w:p>
+    <w:p>
+      <w:pPr>
+        <w:spacing w:line="278" w:lineRule="auto"/>
+        <w:jc w:val="both"/>
+        <w:rPr>
+          <w:ins w:id="1110" w:author="Victor Furlan" w:date="2026-10-20T21:51:00Z" w16du:dateUtc="2026-10-20T20:51:00Z"/>
+        </w:rPr>
+      </w:pPr>
+      <w:ins w:id="1111" w:author="Victor Furlan" w:date="2026-10-20T21:51:00Z" w16du:dateUtc="2026-10-20T20:51:00Z">
+        <w:r>
+          <w:t>•</w:t>
+        </w:r>
+      </w:ins>
+      <w:ins w:id="1112" w:author="Victor Furlan" w:date="2026-10-20T21:52:00Z" w16du:dateUtc="2026-10-20T20:52:00Z">
+        <w:r>
+          <w:t xml:space="preserve"> </w:t>
+        </w:r>
+      </w:ins>
+      <w:ins w:id="1113" w:author="Victor Furlan" w:date="2026-10-20T21:51:00Z" w16du:dateUtc="2026-10-20T20:51:00Z">
+        <w:r>
+          <w:t>A cleaned dataset prepared for analysis, stored securely and not published if it contains personal information.</w:t>
+        </w:r>
+      </w:ins>
+    </w:p>
+    <w:p>
+      <w:pPr>
+        <w:spacing w:line="278" w:lineRule="auto"/>
+        <w:jc w:val="both"/>
+        <w:rPr>
+          <w:ins w:id="1114" w:author="Victor Furlan" w:date="2026-10-20T21:51:00Z" w16du:dateUtc="2026-10-20T20:51:00Z"/>
+        </w:rPr>
+      </w:pPr>
+      <w:ins w:id="1115" w:author="Victor Furlan" w:date="2026-10-20T21:51:00Z" w16du:dateUtc="2026-10-20T20:51:00Z">
+        <w:r>
+          <w:t>•</w:t>
+        </w:r>
+      </w:ins>
+      <w:ins w:id="1116" w:author="Victor Furlan" w:date="2026-10-20T21:52:00Z" w16du:dateUtc="2026-10-20T20:52:00Z">
+        <w:r>
+          <w:t xml:space="preserve"> </w:t>
+        </w:r>
+      </w:ins>
+      <w:ins w:id="1117" w:author="Victor Furlan" w:date="2026-10-20T21:51:00Z" w16du:dateUtc="2026-10-20T20:51:00Z">
+        <w:r>
+          <w:t>A Jupyter Notebook documenting the cleaning steps, analysis, charts and modelling process.</w:t>
+        </w:r>
+      </w:ins>
+    </w:p>
+    <w:p>
+      <w:pPr>
+        <w:spacing w:line="278" w:lineRule="auto"/>
+        <w:jc w:val="both"/>
+        <w:rPr>
+          <w:ins w:id="1118" w:author="Victor Furlan" w:date="2026-10-20T21:51:00Z" w16du:dateUtc="2026-10-20T20:51:00Z"/>
+        </w:rPr>
+      </w:pPr>
+      <w:ins w:id="1119" w:author="Victor Furlan" w:date="2026-10-20T21:51:00Z" w16du:dateUtc="2026-10-20T20:51:00Z">
+        <w:r>
+          <w:lastRenderedPageBreak/>
+          <w:t>•</w:t>
+        </w:r>
+      </w:ins>
+      <w:ins w:id="1120" w:author="Victor Furlan" w:date="2026-10-20T21:52:00Z" w16du:dateUtc="2026-10-20T20:52:00Z">
+        <w:r>
+          <w:t xml:space="preserve"> </w:t>
+        </w:r>
+      </w:ins>
+      <w:ins w:id="1121" w:author="Victor Furlan" w:date="2026-10-20T21:51:00Z" w16du:dateUtc="2026-10-20T20:51:00Z">
+        <w:r>
+          <w:t>Descriptive statistics and visualisations showing the main patterns in cinema attendance and preferences.</w:t>
+        </w:r>
+      </w:ins>
+    </w:p>
+    <w:p>
+      <w:pPr>
+        <w:spacing w:line="278" w:lineRule="auto"/>
+        <w:jc w:val="both"/>
+        <w:rPr>
+          <w:ins w:id="1122" w:author="Victor Furlan" w:date="2026-10-20T21:51:00Z" w16du:dateUtc="2026-10-20T20:51:00Z"/>
+        </w:rPr>
+      </w:pPr>
+      <w:ins w:id="1123" w:author="Victor Furlan" w:date="2026-10-20T21:51:00Z" w16du:dateUtc="2026-10-20T20:51:00Z">
+        <w:r>
+          <w:t>•</w:t>
+        </w:r>
+      </w:ins>
+      <w:ins w:id="1124" w:author="Victor Furlan" w:date="2026-10-20T21:52:00Z" w16du:dateUtc="2026-10-20T20:52:00Z">
+        <w:r>
+          <w:t xml:space="preserve"> </w:t>
+        </w:r>
+      </w:ins>
+      <w:ins w:id="1125" w:author="Victor Furlan" w:date="2026-10-20T21:51:00Z" w16du:dateUtc="2026-10-20T20:51:00Z">
+        <w:r>
+          <w:t>An analysis of factors associated with reported attendance frequency.</w:t>
+        </w:r>
+      </w:ins>
+    </w:p>
+    <w:p>
+      <w:pPr>
+        <w:spacing w:line="278" w:lineRule="auto"/>
+        <w:jc w:val="both"/>
+        <w:rPr>
+          <w:ins w:id="1126" w:author="Victor Furlan" w:date="2026-10-20T21:51:00Z" w16du:dateUtc="2026-10-20T20:51:00Z"/>
+        </w:rPr>
+      </w:pPr>
+      <w:ins w:id="1127" w:author="Victor Furlan" w:date="2026-10-20T21:51:00Z" w16du:dateUtc="2026-10-20T20:51:00Z">
+        <w:r>
+          <w:t>•</w:t>
+        </w:r>
+      </w:ins>
+      <w:ins w:id="1128" w:author="Victor Furlan" w:date="2026-10-20T21:52:00Z" w16du:dateUtc="2026-10-20T20:52:00Z">
+        <w:r>
+          <w:t xml:space="preserve"> </w:t>
+        </w:r>
+      </w:ins>
+      <w:ins w:id="1129" w:author="Victor Furlan" w:date="2026-10-20T21:51:00Z" w16du:dateUtc="2026-10-20T20:51:00Z">
+        <w:r>
+          <w:t>A comparison of suitable predictive models, if the dataset supports reliable evaluation.</w:t>
+        </w:r>
+      </w:ins>
+    </w:p>
+    <w:p>
+      <w:pPr>
+        <w:spacing w:line="278" w:lineRule="auto"/>
+        <w:jc w:val="both"/>
+        <w:rPr>
+          <w:ins w:id="1130" w:author="Victor Furlan" w:date="2026-10-20T21:51:00Z" w16du:dateUtc="2026-10-20T20:51:00Z"/>
+        </w:rPr>
+      </w:pPr>
+      <w:ins w:id="1131" w:author="Victor Furlan" w:date="2026-10-20T21:51:00Z" w16du:dateUtc="2026-10-20T20:51:00Z">
+        <w:r>
+          <w:t>•</w:t>
+        </w:r>
+        <w:r>
+          <w:t xml:space="preserve"> </w:t>
+        </w:r>
+        <w:r>
+          <w:t>Business recommendations linked to the findings, with limitations clearly explained.</w:t>
+        </w:r>
+      </w:ins>
+    </w:p>
+    <w:p>
+      <w:pPr>
+        <w:spacing w:line="278" w:lineRule="auto"/>
+        <w:jc w:val="both"/>
+        <w:rPr>
+          <w:ins w:id="1132" w:author="Victor Furlan" w:date="2026-10-20T21:51:00Z" w16du:dateUtc="2026-10-20T20:51:00Z"/>
+        </w:rPr>
+      </w:pPr>
+      <w:ins w:id="1133" w:author="Victor Furlan" w:date="2026-10-20T21:51:00Z" w16du:dateUtc="2026-10-20T20:51:00Z">
+        <w:r>
+          <w:t>•</w:t>
+        </w:r>
+        <w:r>
+          <w:t xml:space="preserve"> </w:t>
+        </w:r>
+        <w:r>
+          <w:t>A final project report describing the business problem, data, methods, results, ethical considerations and conclusions.</w:t>
+        </w:r>
+      </w:ins>
+    </w:p>
+    <w:p>
+      <w:pPr>
+        <w:spacing w:line="278" w:lineRule="auto"/>
+        <w:jc w:val="both"/>
+        <w:rPr>
+          <w:ins w:id="1134" w:author="Victor Furlan" w:date="2026-10-20T21:51:00Z" w16du:dateUtc="2026-10-20T20:51:00Z"/>
+        </w:rPr>
+      </w:pPr>
+      <w:ins w:id="1135" w:author="Victor Furlan" w:date="2026-10-20T21:51:00Z" w16du:dateUtc="2026-10-20T20:51:00Z">
+        <w:r>
+          <w:t>The deliverables will demonstrate how data analytics can be applied to a practical business question. Recommendations will be based on the results rather than on assumptions about what customers want.</w:t>
+        </w:r>
+      </w:ins>
+    </w:p>
+    <w:p>
+      <w:pPr>
+        <w:spacing w:line="278" w:lineRule="auto"/>
+        <w:jc w:val="both"/>
+        <w:rPr>
+          <w:ins w:id="1136" w:author="Victor Furlan" w:date="2026-10-20T21:51:00Z" w16du:dateUtc="2026-10-20T20:51:00Z"/>
+          <w:b/>
+          <w:bCs/>
+          <w:rPrChange w:id="1137" w:author="Victor Furlan" w:date="2026-10-20T21:53:00Z" w16du:dateUtc="2026-10-20T20:53:00Z">
+            <w:rPr>
+              <w:ins w:id="1138" w:author="Victor Furlan" w:date="2026-10-20T21:51:00Z" w16du:dateUtc="2026-10-20T20:51:00Z"/>
+            </w:rPr>
+          </w:rPrChange>
+        </w:rPr>
+      </w:pPr>
+      <w:ins w:id="1139" w:author="Victor Furlan" w:date="2026-10-20T21:51:00Z" w16du:dateUtc="2026-10-20T20:51:00Z">
+        <w:r>
+          <w:rPr>
+            <w:b/>
+            <w:bCs/>
+            <w:rPrChange w:id="1140" w:author="Victor Furlan" w:date="2026-10-20T21:53:00Z" w16du:dateUtc="2026-10-20T20:53:00Z">
+              <w:rPr/>
+            </w:rPrChange>
+          </w:rPr>
+          <w:t>8. Project Timeline</w:t>
+        </w:r>
+      </w:ins>
+    </w:p>
+    <w:p>
+      <w:pPr>
+        <w:spacing w:line="278" w:lineRule="auto"/>
+        <w:jc w:val="both"/>
+        <w:rPr>
+          <w:ins w:id="1141" w:author="Victor Furlan" w:date="2026-10-20T21:52:00Z" w16du:dateUtc="2026-10-20T20:52:00Z"/>
+        </w:rPr>
+      </w:pPr>
+      <w:ins w:id="1142" w:author="Victor Furlan" w:date="2026-10-20T21:51:00Z" w16du:dateUtc="2026-10-20T20:51:00Z">
+        <w:r>
+          <w:t>The following is an illustrative 30-week plan across two semesters. I will align the weeks with the actual CCT College calendar and any ethics approval requirements. Data collection and modelling may need to be adjusted if response numbers are lower than expected.</w:t>
+        </w:r>
+      </w:ins>
+    </w:p>
+    <w:p>
+      <w:pPr>
+        <w:spacing w:line="278" w:lineRule="auto"/>
+        <w:jc w:val="both"/>
+        <w:rPr>
+          <w:ins w:id="1143" w:author="Victor Furlan" w:date="2026-10-20T21:52:00Z" w16du:dateUtc="2026-10-20T20:52:00Z"/>
+        </w:rPr>
+      </w:pPr>
+    </w:p>
+    <w:p>
+      <w:pPr>
+        <w:spacing w:line="278" w:lineRule="auto"/>
+        <w:jc w:val="both"/>
+        <w:pPrChange w:id="1144" w:author="Victor Furlan" w:date="2026-10-20T21:50:00Z" w16du:dateUtc="2026-10-20T20:50:00Z">
           <w:pPr/>
         </w:pPrChange>
       </w:pPr>
-      <w:ins w:id="1089" w:author="Victor Furlan" w:date="2026-10-16T21:21:00Z" w16du:dateUtc="2026-10-16T20:21:00Z">
-        <w:r>
-          <w:t>ADD PICTURE</w:t>
+      <w:ins w:id="1145" w:author="Victor Furlan" w:date="2026-10-20T21:52:00Z" w16du:dateUtc="2026-10-20T20:52:00Z">
+        <w:r>
+          <w:t>PICTURE</w:t>
+        </w:r>
+        <w:r>
+          <w:br/>
+        </w:r>
+        <w:r>
+          <w:br/>
         </w:r>
       </w:ins>
     </w:p>
@@ -12182,6 +12609,10 @@
 </file>
 
 <file path=customXml/item1.xml><?xml version="1.0" encoding="utf-8"?>
+<b:Sources xmlns:b="http://schemas.openxmlformats.org/officeDocument/2006/bibliography" xmlns="http://schemas.openxmlformats.org/officeDocument/2006/bibliography" SelectedStyle="\APASixthEditionOfficeOnline.xsl" StyleName="APA" Version="6"/>
+</file>
+
+<file path=customXml/item2.xml><?xml version="1.0" encoding="utf-8"?>
 <ct:contentTypeSchema xmlns:ct="http://schemas.microsoft.com/office/2006/metadata/contentType" xmlns:ma="http://schemas.microsoft.com/office/2006/metadata/properties/metaAttributes" ct:_="" ma:_="" ma:contentTypeName="Document" ma:contentTypeID="0x01010091CA7052A48FB44E8BAE44044031FC77" ma:contentTypeVersion="5" ma:contentTypeDescription="Create a new document." ma:contentTypeScope="" ma:versionID="72110da391d7bf7bbbd9879cda66318c">
   <xsd:schema xmlns:xsd="http://www.w3.org/2001/XMLSchema" xmlns:xs="http://www.w3.org/2001/XMLSchema" xmlns:p="http://schemas.microsoft.com/office/2006/metadata/properties" xmlns:ns3="b16a9495-4dfd-42d3-807b-98cb11f03b43" targetNamespace="http://schemas.microsoft.com/office/2006/metadata/properties" ma:root="true" ma:fieldsID="65d4c4ab10123b5e2192ffab3149626d" ns3:_="">
     <xsd:import namespace="b16a9495-4dfd-42d3-807b-98cb11f03b43"/>
@@ -12331,17 +12762,10 @@
 </ct:contentTypeSchema>
 </file>
 
-<file path=customXml/item2.xml><?xml version="1.0" encoding="utf-8"?>
-<b:Sources xmlns:b="http://schemas.openxmlformats.org/officeDocument/2006/bibliography" xmlns="http://schemas.openxmlformats.org/officeDocument/2006/bibliography" SelectedStyle="\APASixthEditionOfficeOnline.xsl" StyleName="APA" Version="6"/>
-</file>
-
 <file path=customXml/item3.xml><?xml version="1.0" encoding="utf-8"?>
-<?mso-contentType ?>
-<FormTemplates xmlns="http://schemas.microsoft.com/sharepoint/v3/contenttype/forms">
-  <Display>DocumentLibraryForm</Display>
-  <Edit>DocumentLibraryForm</Edit>
-  <New>DocumentLibraryForm</New>
-</FormTemplates>
+<go:gDocsCustomXmlDataStorage xmlns:go="http://customooxmlschemas.google.com/" xmlns:r="http://schemas.openxmlformats.org/officeDocument/2006/relationships" uri="GoogleDocsCustomDataVersion2">
+  <go:docsCustomData xmlns:go="http://customooxmlschemas.google.com/" roundtripDataSignature="AMtx7miehlgh2pzFvkmpnhkVaeODs3Wnuw==">CgMxLjAyCGguZ2pkZ3hzMgloLjMwajB6bGwyCWguMWZvYjl0ZTIJaC4zem55c2g3MgloLjJldDkycDAyDmgua2ZranMzcndsMmMxOAByITF6bEVRVXYyWkdtTjZWemdfYk5uaGpmb0x1c2hhYUo3dw==</go:docsCustomData>
+</go:gDocsCustomXmlDataStorage>
 </file>
 
 <file path=customXml/item4.xml><?xml version="1.0" encoding="utf-8"?>
@@ -12353,12 +12777,23 @@
 </file>
 
 <file path=customXml/item5.xml><?xml version="1.0" encoding="utf-8"?>
-<go:gDocsCustomXmlDataStorage xmlns:go="http://customooxmlschemas.google.com/" xmlns:r="http://schemas.openxmlformats.org/officeDocument/2006/relationships" uri="GoogleDocsCustomDataVersion2">
-  <go:docsCustomData xmlns:go="http://customooxmlschemas.google.com/" roundtripDataSignature="AMtx7miehlgh2pzFvkmpnhkVaeODs3Wnuw==">CgMxLjAyCGguZ2pkZ3hzMgloLjMwajB6bGwyCWguMWZvYjl0ZTIJaC4zem55c2g3MgloLjJldDkycDAyDmgua2ZranMzcndsMmMxOAByITF6bEVRVXYyWkdtTjZWemdfYk5uaGpmb0x1c2hhYUo3dw==</go:docsCustomData>
-</go:gDocsCustomXmlDataStorage>
+<?mso-contentType ?>
+<FormTemplates xmlns="http://schemas.microsoft.com/sharepoint/v3/contenttype/forms">
+  <Display>DocumentLibraryForm</Display>
+  <Edit>DocumentLibraryForm</Edit>
+  <New>DocumentLibraryForm</New>
+</FormTemplates>
 </file>
 
 <file path=customXml/itemProps1.xml><?xml version="1.0" encoding="utf-8"?>
+<ds:datastoreItem xmlns:ds="http://schemas.openxmlformats.org/officeDocument/2006/customXml" ds:itemID="{A5C61161-19E4-4D42-A5DA-EC591AFE0A7D}">
+  <ds:schemaRefs>
+    <ds:schemaRef ds:uri="http://schemas.openxmlformats.org/officeDocument/2006/bibliography"/>
+  </ds:schemaRefs>
+</ds:datastoreItem>
+</file>
+
+<file path=customXml/itemProps2.xml><?xml version="1.0" encoding="utf-8"?>
 <ds:datastoreItem xmlns:ds="http://schemas.openxmlformats.org/officeDocument/2006/customXml" ds:itemID="{1CD39011-2B34-4226-8638-59B13D86301D}">
   <ds:schemaRefs>
     <ds:schemaRef ds:uri="http://schemas.microsoft.com/office/2006/metadata/contentType"/>
@@ -12376,18 +12811,11 @@
 </ds:datastoreItem>
 </file>
 
-<file path=customXml/itemProps2.xml><?xml version="1.0" encoding="utf-8"?>
-<ds:datastoreItem xmlns:ds="http://schemas.openxmlformats.org/officeDocument/2006/customXml" ds:itemID="{A5C61161-19E4-4D42-A5DA-EC591AFE0A7D}">
+<file path=customXml/itemProps3.xml><?xml version="1.0" encoding="utf-8"?>
+<ds:datastoreItem xmlns:ds="http://schemas.openxmlformats.org/officeDocument/2006/customXml" ds:itemID="{11111111-1234-1234-1234-123412341234}">
   <ds:schemaRefs>
-    <ds:schemaRef ds:uri="http://schemas.openxmlformats.org/officeDocument/2006/bibliography"/>
-  </ds:schemaRefs>
-</ds:datastoreItem>
-</file>
-
-<file path=customXml/itemProps3.xml><?xml version="1.0" encoding="utf-8"?>
-<ds:datastoreItem xmlns:ds="http://schemas.openxmlformats.org/officeDocument/2006/customXml" ds:itemID="{AD64260C-1345-4C21-A804-B9FBE7B91489}">
-  <ds:schemaRefs>
-    <ds:schemaRef ds:uri="http://schemas.microsoft.com/sharepoint/v3/contenttype/forms"/>
+    <ds:schemaRef ds:uri="http://customooxmlschemas.google.com/"/>
+    <ds:schemaRef ds:uri="http://schemas.openxmlformats.org/officeDocument/2006/relationships"/>
   </ds:schemaRefs>
 </ds:datastoreItem>
 </file>
@@ -12403,10 +12831,9 @@
 </file>
 
 <file path=customXml/itemProps5.xml><?xml version="1.0" encoding="utf-8"?>
-<ds:datastoreItem xmlns:ds="http://schemas.openxmlformats.org/officeDocument/2006/customXml" ds:itemID="{11111111-1234-1234-1234-123412341234}">
+<ds:datastoreItem xmlns:ds="http://schemas.openxmlformats.org/officeDocument/2006/customXml" ds:itemID="{AD64260C-1345-4C21-A804-B9FBE7B91489}">
   <ds:schemaRefs>
-    <ds:schemaRef ds:uri="http://customooxmlschemas.google.com/"/>
-    <ds:schemaRef ds:uri="http://schemas.openxmlformats.org/officeDocument/2006/relationships"/>
+    <ds:schemaRef ds:uri="http://schemas.microsoft.com/sharepoint/v3/contenttype/forms"/>
   </ds:schemaRefs>
 </ds:datastoreItem>
 </file>
</xml_diff>